<commit_message>
feat: L4 systemization — pipeline, summary, report, bugfixes
- Add src/pipeline.py: 13-step orchestration class with CLI support
- Add generate_final_report.py: L4 report with embedded charts
- Add outputs/L1-L4答辩对照摘要.txt: defense summary map
- Fix plot_distribution single-column crash in plots.py
- Fix os import scope in pipeline.py
- Update test_predictions.csv and report with latest results
</commit_message>
<xml_diff>
--- a/蓝莓产量预测分析实训报告.docx
+++ b/蓝莓产量预测分析实训报告.docx
@@ -4,7 +4,7 @@
   <w:body>
     <w:p>
       <w:pPr>
-        <w:spacing w:after="240"/>
+        <w:spacing w:after="200"/>
         <w:jc w:val="center"/>
       </w:pPr>
       <w:r>
@@ -18,21 +18,21 @@
     </w:p>
     <w:p>
       <w:pPr>
-        <w:spacing w:after="240"/>
+        <w:spacing w:after="200"/>
         <w:jc w:val="center"/>
       </w:pPr>
       <w:r>
         <w:rPr>
           <w:rFonts w:ascii="黑体" w:hAnsi="黑体" w:eastAsia="黑体"/>
           <w:b w:val="0"/>
-          <w:sz w:val="32"/>
+          <w:sz w:val="28"/>
         </w:rPr>
-        <w:t>软件工程实训报告</w:t>
+        <w:t>软件工程实训报告（L4系统化版本）</w:t>
       </w:r>
     </w:p>
     <w:p>
       <w:pPr>
-        <w:spacing w:line="360" w:lineRule="auto" w:after="120"/>
+        <w:spacing w:after="80"/>
         <w:ind w:firstLine="480"/>
       </w:pPr>
       <w:r>
@@ -45,15 +45,56 @@
     </w:p>
     <w:p>
       <w:pPr>
-        <w:pStyle w:val="Heading1"/>
+        <w:jc w:val="center"/>
       </w:pPr>
       <w:r>
-        <w:t>基本信息与个人任务</w:t>
+        <w:rPr>
+          <w:rFonts w:ascii="宋体" w:hAnsi="宋体" w:eastAsia="宋体"/>
+          <w:sz w:val="28"/>
+        </w:rPr>
+        <w:t>姓    名：王梓宇</w:t>
       </w:r>
     </w:p>
     <w:p>
       <w:pPr>
-        <w:spacing w:line="360" w:lineRule="auto" w:after="120"/>
+        <w:jc w:val="center"/>
+      </w:pPr>
+      <w:r>
+        <w:rPr>
+          <w:rFonts w:ascii="宋体" w:hAnsi="宋体" w:eastAsia="宋体"/>
+          <w:sz w:val="28"/>
+        </w:rPr>
+        <w:t>学    校：中国石油大学（华东）</w:t>
+      </w:r>
+    </w:p>
+    <w:p>
+      <w:pPr>
+        <w:jc w:val="center"/>
+      </w:pPr>
+      <w:r>
+        <w:rPr>
+          <w:rFonts w:ascii="宋体" w:hAnsi="宋体" w:eastAsia="宋体"/>
+          <w:sz w:val="28"/>
+        </w:rPr>
+        <w:t>实训周期：2026.06.29 — 2026.07.13</w:t>
+      </w:r>
+    </w:p>
+    <w:p>
+      <w:r>
+        <w:br w:type="page"/>
+      </w:r>
+    </w:p>
+    <w:p>
+      <w:pPr>
+        <w:pStyle w:val="Heading1"/>
+      </w:pPr>
+      <w:r>
+        <w:t>一、基本信息与个人任务</w:t>
+      </w:r>
+    </w:p>
+    <w:p>
+      <w:pPr>
+        <w:spacing w:after="80"/>
       </w:pPr>
       <w:r>
         <w:rPr>
@@ -66,7 +107,7 @@
     </w:p>
     <w:p>
       <w:pPr>
-        <w:spacing w:line="360" w:lineRule="auto" w:after="120"/>
+        <w:spacing w:after="80"/>
       </w:pPr>
       <w:r>
         <w:rPr>
@@ -79,7 +120,7 @@
     </w:p>
     <w:p>
       <w:pPr>
-        <w:spacing w:line="360" w:lineRule="auto" w:after="120"/>
+        <w:spacing w:after="80"/>
       </w:pPr>
       <w:r>
         <w:rPr>
@@ -92,7 +133,7 @@
     </w:p>
     <w:p>
       <w:pPr>
-        <w:spacing w:line="360" w:lineRule="auto" w:after="120"/>
+        <w:spacing w:after="80"/>
       </w:pPr>
       <w:r>
         <w:rPr>
@@ -100,12 +141,12 @@
           <w:b w:val="0"/>
           <w:sz w:val="24"/>
         </w:rPr>
-        <w:t>开发技术栈：Python 3.12 + NumPy + Pandas + Scikit-learn + Matplotlib + Seaborn + statsmodels</w:t>
+        <w:t>技术栈：Python 3.12 + NumPy + Pandas + Scikit-learn + Matplotlib + Seaborn + SciPy + statsmodels</w:t>
       </w:r>
     </w:p>
     <w:p>
       <w:pPr>
-        <w:spacing w:line="360" w:lineRule="auto" w:after="120"/>
+        <w:spacing w:after="80"/>
       </w:pPr>
       <w:r>
         <w:rPr>
@@ -118,7 +159,7 @@
     </w:p>
     <w:p>
       <w:pPr>
-        <w:spacing w:line="360" w:lineRule="auto" w:after="120"/>
+        <w:spacing w:after="80"/>
       </w:pPr>
       <w:r>
         <w:rPr>
@@ -126,25 +167,12 @@
           <w:b w:val="0"/>
           <w:sz w:val="24"/>
         </w:rPr>
-        <w:t>本人分工：全流程数据分析与建模，负责数据预处理、特征工程、聚类分析、回归建模、随机森林训练、模型对比评估、可视化图表生成、测试集预测输出。</w:t>
+        <w:t>本人分工：全流程数据分析与建模（独立完成），覆盖数据预处理、探索性分析、特征工程、K-Means聚类、Ridge/Lasso回归、随机森林、超参数调优、交叉验证、模型对比评估、可视化、测试集预测。</w:t>
       </w:r>
     </w:p>
     <w:p>
       <w:pPr>
-        <w:spacing w:line="360" w:lineRule="auto" w:after="120"/>
-      </w:pPr>
-      <w:r>
-        <w:rPr>
-          <w:rFonts w:ascii="宋体" w:hAnsi="宋体" w:eastAsia="宋体"/>
-          <w:b w:val="0"/>
-          <w:sz w:val="24"/>
-        </w:rPr>
-        <w:t>核心任务：</w:t>
-      </w:r>
-    </w:p>
-    <w:p>
-      <w:pPr>
-        <w:spacing w:line="360" w:lineRule="auto" w:after="120"/>
+        <w:spacing w:after="80"/>
         <w:ind w:firstLine="480"/>
       </w:pPr>
       <w:r>
@@ -153,12 +181,84 @@
           <w:b w:val="0"/>
           <w:sz w:val="24"/>
         </w:rPr>
-        <w:t xml:space="preserve">    (1) 完成数据加载、清洗、标准化等全流程预处理；</w:t>
       </w:r>
     </w:p>
     <w:p>
       <w:pPr>
-        <w:spacing w:line="360" w:lineRule="auto" w:after="120"/>
+        <w:spacing w:after="80"/>
+      </w:pPr>
+      <w:r>
+        <w:rPr>
+          <w:rFonts w:ascii="宋体" w:hAnsi="宋体" w:eastAsia="宋体"/>
+          <w:b w:val="0"/>
+          <w:sz w:val="24"/>
+        </w:rPr>
+        <w:t>对应评分等级：</w:t>
+      </w:r>
+    </w:p>
+    <w:p>
+      <w:pPr>
+        <w:spacing w:after="80"/>
+      </w:pPr>
+      <w:r>
+        <w:rPr>
+          <w:rFonts w:ascii="宋体" w:hAnsi="宋体" w:eastAsia="宋体"/>
+          <w:b w:val="0"/>
+          <w:sz w:val="24"/>
+        </w:rPr>
+        <w:t>L1 完成分析过程：全流程 main.py 一键运行，从原始数据到预测结果全自动化。</w:t>
+      </w:r>
+    </w:p>
+    <w:p>
+      <w:pPr>
+        <w:spacing w:after="80"/>
+      </w:pPr>
+      <w:r>
+        <w:rPr>
+          <w:rFonts w:ascii="宋体" w:hAnsi="宋体" w:eastAsia="宋体"/>
+          <w:b w:val="0"/>
+          <w:sz w:val="24"/>
+        </w:rPr>
+        <w:t>L2 过程清晰合理选模：命令行接口（--mode/--tune），K-Means聚类选优K、PCA降维去共线、Ridge/Lasso/RF对比。</w:t>
+      </w:r>
+    </w:p>
+    <w:p>
+      <w:pPr>
+        <w:spacing w:after="80"/>
+      </w:pPr>
+      <w:r>
+        <w:rPr>
+          <w:rFonts w:ascii="宋体" w:hAnsi="宋体" w:eastAsia="宋体"/>
+          <w:b w:val="0"/>
+          <w:sz w:val="24"/>
+        </w:rPr>
+        <w:t>L3 报告完整翔实有创意：果实特征对照实验（R² 0.78→0.33），聚类雷达图业务解读，特征重要性排序+排列重要性验证。</w:t>
+      </w:r>
+    </w:p>
+    <w:p>
+      <w:pPr>
+        <w:spacing w:after="80"/>
+      </w:pPr>
+      <w:r>
+        <w:rPr>
+          <w:rFonts w:ascii="宋体" w:hAnsi="宋体" w:eastAsia="宋体"/>
+          <w:b w:val="0"/>
+          <w:sz w:val="24"/>
+        </w:rPr>
+        <w:t>L4 系统化：可复现流水线、k折交叉验证、学习曲线诊断、偏依赖图、雷达图、业务落地建议。</w:t>
+      </w:r>
+    </w:p>
+    <w:p>
+      <w:pPr>
+        <w:pStyle w:val="Heading1"/>
+      </w:pPr>
+      <w:r>
+        <w:t>二、任务分析</w:t>
+      </w:r>
+    </w:p>
+    <w:p>
+      <w:pPr>
+        <w:spacing w:after="80"/>
         <w:ind w:firstLine="480"/>
       </w:pPr>
       <w:r>
@@ -167,12 +267,12 @@
           <w:b w:val="0"/>
           <w:sz w:val="24"/>
         </w:rPr>
-        <w:t xml:space="preserve">    (1) 设计并实现K-Means聚类分析，结合PCA降维可视化，对各簇进行特征偏离解读；</w:t>
+        <w:t>业务背景：野生蓝莓是北美高价值经济作物。种植者需要在开花前预判产量，以提前规划蜂箱投放、灌溉和施肥。如果预测偏差过大，蜂箱投入不足导致授粉不充分减产，或投入过剩造成成本浪费。</w:t>
       </w:r>
     </w:p>
     <w:p>
       <w:pPr>
-        <w:spacing w:line="360" w:lineRule="auto" w:after="120"/>
+        <w:spacing w:after="80"/>
         <w:ind w:firstLine="480"/>
       </w:pPr>
       <w:r>
@@ -181,12 +281,12 @@
           <w:b w:val="0"/>
           <w:sz w:val="24"/>
         </w:rPr>
-        <w:t xml:space="preserve">    (1) 构建Ridge/Lasso线性回归模型，完成果实特征对照实验（核心创新点）；</w:t>
+        <w:t>核心问题：如何仅凭种植前可获取的环境变量（蜜蜂种群密度、温度、降雨、种植规模），构建合理的产量预测模型？</w:t>
       </w:r>
     </w:p>
     <w:p>
       <w:pPr>
-        <w:spacing w:line="360" w:lineRule="auto" w:after="120"/>
+        <w:spacing w:after="80"/>
         <w:ind w:firstLine="480"/>
       </w:pPr>
       <w:r>
@@ -195,71 +295,7 @@
           <w:b w:val="0"/>
           <w:sz w:val="24"/>
         </w:rPr>
-        <w:t xml:space="preserve">    (1) 训练随机森林模型，进行特征重要性分析与多模型对比评估；</w:t>
-      </w:r>
-    </w:p>
-    <w:p>
-      <w:pPr>
-        <w:spacing w:line="360" w:lineRule="auto" w:after="120"/>
-        <w:ind w:firstLine="480"/>
-      </w:pPr>
-      <w:r>
-        <w:rPr>
-          <w:rFonts w:ascii="宋体" w:hAnsi="宋体" w:eastAsia="宋体"/>
-          <w:b w:val="0"/>
-          <w:sz w:val="24"/>
-        </w:rPr>
-        <w:t xml:space="preserve">    (1) 生成12张分析图表，输出测试集产量预测结果。</w:t>
-      </w:r>
-    </w:p>
-    <w:p>
-      <w:pPr>
-        <w:pStyle w:val="Heading1"/>
-      </w:pPr>
-      <w:r>
-        <w:t>一、任务分析</w:t>
-      </w:r>
-    </w:p>
-    <w:p>
-      <w:pPr>
-        <w:spacing w:line="360" w:lineRule="auto" w:after="120"/>
-        <w:ind w:firstLine="480"/>
-      </w:pPr>
-      <w:r>
-        <w:rPr>
-          <w:rFonts w:ascii="宋体" w:hAnsi="宋体" w:eastAsia="宋体"/>
-          <w:b w:val="0"/>
-          <w:sz w:val="24"/>
-        </w:rPr>
-        <w:t>本项目基于野生蓝莓种植数据，目标是通过气候条件、蜜蜂种群分布、果树特征等多维度变量预测蓝莓产量（yield）。数据集包含训练集（含产量标签）和测试集（无标签），训练集用于模型训练与交叉验证，测试集用于最终产量预测。</w:t>
-      </w:r>
-    </w:p>
-    <w:p>
-      <w:pPr>
-        <w:spacing w:line="360" w:lineRule="auto" w:after="120"/>
-        <w:ind w:firstLine="480"/>
-      </w:pPr>
-      <w:r>
-        <w:rPr>
-          <w:rFonts w:ascii="宋体" w:hAnsi="宋体" w:eastAsia="宋体"/>
-          <w:b w:val="0"/>
-          <w:sz w:val="24"/>
-        </w:rPr>
-        <w:t>核心分析目标：(1) 探索各特征与产量的相关性，识别影响蓝莓产量的关键因素；(2) 通过聚类分析发现不同种植环境的内在分组结构；(3) 对比不同特征组合和多种模型的预测效果；(4) 生成测试集的产量预测结果。</w:t>
-      </w:r>
-    </w:p>
-    <w:p>
-      <w:pPr>
-        <w:spacing w:line="360" w:lineRule="auto" w:after="120"/>
-        <w:ind w:firstLine="480"/>
-      </w:pPr>
-      <w:r>
-        <w:rPr>
-          <w:rFonts w:ascii="宋体" w:hAnsi="宋体" w:eastAsia="宋体"/>
-          <w:b w:val="0"/>
-          <w:sz w:val="24"/>
-        </w:rPr>
-        <w:t>数据集特征变量分类如下表所示：</w:t>
+        <w:t>数据集包含15,289条训练样本（含产量标签）和10,194条测试样本（无标签），17个特征变量分为5类：</w:t>
       </w:r>
     </w:p>
     <w:tbl>
@@ -270,15 +306,15 @@
         <w:tblLook w:firstColumn="1" w:firstRow="1" w:lastColumn="0" w:lastRow="0" w:noHBand="0" w:noVBand="1" w:val="04A0"/>
       </w:tblPr>
       <w:tblGrid>
-        <w:gridCol w:w="2268"/>
-        <w:gridCol w:w="2268"/>
-        <w:gridCol w:w="2268"/>
-        <w:gridCol w:w="2268"/>
+        <w:gridCol w:w="2256"/>
+        <w:gridCol w:w="2256"/>
+        <w:gridCol w:w="2256"/>
+        <w:gridCol w:w="2256"/>
       </w:tblGrid>
       <w:tr>
         <w:tc>
           <w:tcPr>
-            <w:tcW w:type="dxa" w:w="2268"/>
+            <w:tcW w:type="dxa" w:w="2256"/>
             <w:shd w:fill="D9E2F3" w:val="clear"/>
           </w:tcPr>
           <w:p>
@@ -298,7 +334,7 @@
         </w:tc>
         <w:tc>
           <w:tcPr>
-            <w:tcW w:type="dxa" w:w="2268"/>
+            <w:tcW w:type="dxa" w:w="2256"/>
             <w:shd w:fill="D9E2F3" w:val="clear"/>
           </w:tcPr>
           <w:p>
@@ -318,7 +354,7 @@
         </w:tc>
         <w:tc>
           <w:tcPr>
-            <w:tcW w:type="dxa" w:w="2268"/>
+            <w:tcW w:type="dxa" w:w="2256"/>
             <w:shd w:fill="D9E2F3" w:val="clear"/>
           </w:tcPr>
           <w:p>
@@ -338,7 +374,7 @@
         </w:tc>
         <w:tc>
           <w:tcPr>
-            <w:tcW w:type="dxa" w:w="2268"/>
+            <w:tcW w:type="dxa" w:w="2256"/>
             <w:shd w:fill="D9E2F3" w:val="clear"/>
           </w:tcPr>
           <w:p>
@@ -360,7 +396,7 @@
       <w:tr>
         <w:tc>
           <w:tcPr>
-            <w:tcW w:type="dxa" w:w="2268"/>
+            <w:tcW w:type="dxa" w:w="2256"/>
           </w:tcPr>
           <w:p>
             <w:pPr>
@@ -378,7 +414,7 @@
         </w:tc>
         <w:tc>
           <w:tcPr>
-            <w:tcW w:type="dxa" w:w="2268"/>
+            <w:tcW w:type="dxa" w:w="2256"/>
           </w:tcPr>
           <w:p>
             <w:pPr>
@@ -396,7 +432,7 @@
         </w:tc>
         <w:tc>
           <w:tcPr>
-            <w:tcW w:type="dxa" w:w="2268"/>
+            <w:tcW w:type="dxa" w:w="2256"/>
           </w:tcPr>
           <w:p>
             <w:pPr>
@@ -408,13 +444,13 @@
                 <w:rFonts w:ascii="宋体" w:hAnsi="宋体" w:eastAsia="宋体"/>
                 <w:sz w:val="20"/>
               </w:rPr>
-              <w:t>4个</w:t>
+              <w:t>4</w:t>
             </w:r>
           </w:p>
         </w:tc>
         <w:tc>
           <w:tcPr>
-            <w:tcW w:type="dxa" w:w="2268"/>
+            <w:tcW w:type="dxa" w:w="2256"/>
           </w:tcPr>
           <w:p>
             <w:pPr>
@@ -426,7 +462,7 @@
                 <w:rFonts w:ascii="宋体" w:hAnsi="宋体" w:eastAsia="宋体"/>
                 <w:sz w:val="20"/>
               </w:rPr>
-              <w:t>不同蜂种的种群数量</w:t>
+              <w:t>不同蜂种数量</w:t>
             </w:r>
           </w:p>
         </w:tc>
@@ -434,7 +470,7 @@
       <w:tr>
         <w:tc>
           <w:tcPr>
-            <w:tcW w:type="dxa" w:w="2268"/>
+            <w:tcW w:type="dxa" w:w="2256"/>
           </w:tcPr>
           <w:p>
             <w:pPr>
@@ -446,13 +482,13 @@
                 <w:rFonts w:ascii="宋体" w:hAnsi="宋体" w:eastAsia="宋体"/>
                 <w:sz w:val="20"/>
               </w:rPr>
-              <w:t>上限温度</w:t>
+              <w:t>温度指标</w:t>
             </w:r>
           </w:p>
         </w:tc>
         <w:tc>
           <w:tcPr>
-            <w:tcW w:type="dxa" w:w="2268"/>
+            <w:tcW w:type="dxa" w:w="2256"/>
           </w:tcPr>
           <w:p>
             <w:pPr>
@@ -464,13 +500,13 @@
                 <w:rFonts w:ascii="宋体" w:hAnsi="宋体" w:eastAsia="宋体"/>
                 <w:sz w:val="20"/>
               </w:rPr>
-              <w:t>max/min/averageofuppertrange</w:t>
+              <w:t>上下限温度 max/min/average × 两组</w:t>
             </w:r>
           </w:p>
         </w:tc>
         <w:tc>
           <w:tcPr>
-            <w:tcW w:type="dxa" w:w="2268"/>
+            <w:tcW w:type="dxa" w:w="2256"/>
           </w:tcPr>
           <w:p>
             <w:pPr>
@@ -482,13 +518,13 @@
                 <w:rFonts w:ascii="宋体" w:hAnsi="宋体" w:eastAsia="宋体"/>
                 <w:sz w:val="20"/>
               </w:rPr>
-              <w:t>3个</w:t>
+              <w:t>6</w:t>
             </w:r>
           </w:p>
         </w:tc>
         <w:tc>
           <w:tcPr>
-            <w:tcW w:type="dxa" w:w="2268"/>
+            <w:tcW w:type="dxa" w:w="2256"/>
           </w:tcPr>
           <w:p>
             <w:pPr>
@@ -500,7 +536,7 @@
                 <w:rFonts w:ascii="宋体" w:hAnsi="宋体" w:eastAsia="宋体"/>
                 <w:sz w:val="20"/>
               </w:rPr>
-              <w:t>生长期温度上限相关指标</w:t>
+              <w:t>生长期温度</w:t>
             </w:r>
           </w:p>
         </w:tc>
@@ -508,7 +544,7 @@
       <w:tr>
         <w:tc>
           <w:tcPr>
-            <w:tcW w:type="dxa" w:w="2268"/>
+            <w:tcW w:type="dxa" w:w="2256"/>
           </w:tcPr>
           <w:p>
             <w:pPr>
@@ -520,87 +556,13 @@
                 <w:rFonts w:ascii="宋体" w:hAnsi="宋体" w:eastAsia="宋体"/>
                 <w:sz w:val="20"/>
               </w:rPr>
-              <w:t>下限温度</w:t>
+              <w:t>降雨</w:t>
             </w:r>
           </w:p>
         </w:tc>
         <w:tc>
           <w:tcPr>
-            <w:tcW w:type="dxa" w:w="2268"/>
-          </w:tcPr>
-          <w:p>
-            <w:pPr>
-              <w:jc w:val="center"/>
-            </w:pPr>
-            <w:r/>
-            <w:r>
-              <w:rPr>
-                <w:rFonts w:ascii="宋体" w:hAnsi="宋体" w:eastAsia="宋体"/>
-                <w:sz w:val="20"/>
-              </w:rPr>
-              <w:t>max/min/averageoflowertrange</w:t>
-            </w:r>
-          </w:p>
-        </w:tc>
-        <w:tc>
-          <w:tcPr>
-            <w:tcW w:type="dxa" w:w="2268"/>
-          </w:tcPr>
-          <w:p>
-            <w:pPr>
-              <w:jc w:val="center"/>
-            </w:pPr>
-            <w:r/>
-            <w:r>
-              <w:rPr>
-                <w:rFonts w:ascii="宋体" w:hAnsi="宋体" w:eastAsia="宋体"/>
-                <w:sz w:val="20"/>
-              </w:rPr>
-              <w:t>3个</w:t>
-            </w:r>
-          </w:p>
-        </w:tc>
-        <w:tc>
-          <w:tcPr>
-            <w:tcW w:type="dxa" w:w="2268"/>
-          </w:tcPr>
-          <w:p>
-            <w:pPr>
-              <w:jc w:val="center"/>
-            </w:pPr>
-            <w:r/>
-            <w:r>
-              <w:rPr>
-                <w:rFonts w:ascii="宋体" w:hAnsi="宋体" w:eastAsia="宋体"/>
-                <w:sz w:val="20"/>
-              </w:rPr>
-              <w:t>生长期温度下限相关指标</w:t>
-            </w:r>
-          </w:p>
-        </w:tc>
-      </w:tr>
-      <w:tr>
-        <w:tc>
-          <w:tcPr>
-            <w:tcW w:type="dxa" w:w="2268"/>
-          </w:tcPr>
-          <w:p>
-            <w:pPr>
-              <w:jc w:val="center"/>
-            </w:pPr>
-            <w:r/>
-            <w:r>
-              <w:rPr>
-                <w:rFonts w:ascii="宋体" w:hAnsi="宋体" w:eastAsia="宋体"/>
-                <w:sz w:val="20"/>
-              </w:rPr>
-              <w:t>降雨天数</w:t>
-            </w:r>
-          </w:p>
-        </w:tc>
-        <w:tc>
-          <w:tcPr>
-            <w:tcW w:type="dxa" w:w="2268"/>
+            <w:tcW w:type="dxa" w:w="2256"/>
           </w:tcPr>
           <w:p>
             <w:pPr>
@@ -618,7 +580,7 @@
         </w:tc>
         <w:tc>
           <w:tcPr>
-            <w:tcW w:type="dxa" w:w="2268"/>
+            <w:tcW w:type="dxa" w:w="2256"/>
           </w:tcPr>
           <w:p>
             <w:pPr>
@@ -630,13 +592,13 @@
                 <w:rFonts w:ascii="宋体" w:hAnsi="宋体" w:eastAsia="宋体"/>
                 <w:sz w:val="20"/>
               </w:rPr>
-              <w:t>2个</w:t>
+              <w:t>2</w:t>
             </w:r>
           </w:p>
         </w:tc>
         <w:tc>
           <w:tcPr>
-            <w:tcW w:type="dxa" w:w="2268"/>
+            <w:tcW w:type="dxa" w:w="2256"/>
           </w:tcPr>
           <w:p>
             <w:pPr>
@@ -648,7 +610,7 @@
                 <w:rFonts w:ascii="宋体" w:hAnsi="宋体" w:eastAsia="宋体"/>
                 <w:sz w:val="20"/>
               </w:rPr>
-              <w:t>降雨天数统计</w:t>
+              <w:t>降雨天数</w:t>
             </w:r>
           </w:p>
         </w:tc>
@@ -656,7 +618,7 @@
       <w:tr>
         <w:tc>
           <w:tcPr>
-            <w:tcW w:type="dxa" w:w="2268"/>
+            <w:tcW w:type="dxa" w:w="2256"/>
           </w:tcPr>
           <w:p>
             <w:pPr>
@@ -674,7 +636,7 @@
         </w:tc>
         <w:tc>
           <w:tcPr>
-            <w:tcW w:type="dxa" w:w="2268"/>
+            <w:tcW w:type="dxa" w:w="2256"/>
           </w:tcPr>
           <w:p>
             <w:pPr>
@@ -692,7 +654,7 @@
         </w:tc>
         <w:tc>
           <w:tcPr>
-            <w:tcW w:type="dxa" w:w="2268"/>
+            <w:tcW w:type="dxa" w:w="2256"/>
           </w:tcPr>
           <w:p>
             <w:pPr>
@@ -704,13 +666,13 @@
                 <w:rFonts w:ascii="宋体" w:hAnsi="宋体" w:eastAsia="宋体"/>
                 <w:sz w:val="20"/>
               </w:rPr>
-              <w:t>3个</w:t>
+              <w:t>3</w:t>
             </w:r>
           </w:p>
         </w:tc>
         <w:tc>
           <w:tcPr>
-            <w:tcW w:type="dxa" w:w="2268"/>
+            <w:tcW w:type="dxa" w:w="2256"/>
           </w:tcPr>
           <w:p>
             <w:pPr>
@@ -722,7 +684,7 @@
                 <w:rFonts w:ascii="宋体" w:hAnsi="宋体" w:eastAsia="宋体"/>
                 <w:sz w:val="20"/>
               </w:rPr>
-              <w:t>坐果率/果实质量/种子数</w:t>
+              <w:t>坐果率/质量/种子数（数据泄露风险）</w:t>
             </w:r>
           </w:p>
         </w:tc>
@@ -730,7 +692,7 @@
       <w:tr>
         <w:tc>
           <w:tcPr>
-            <w:tcW w:type="dxa" w:w="2268"/>
+            <w:tcW w:type="dxa" w:w="2256"/>
           </w:tcPr>
           <w:p>
             <w:pPr>
@@ -748,7 +710,7 @@
         </w:tc>
         <w:tc>
           <w:tcPr>
-            <w:tcW w:type="dxa" w:w="2268"/>
+            <w:tcW w:type="dxa" w:w="2256"/>
           </w:tcPr>
           <w:p>
             <w:pPr>
@@ -766,7 +728,7 @@
         </w:tc>
         <w:tc>
           <w:tcPr>
-            <w:tcW w:type="dxa" w:w="2268"/>
+            <w:tcW w:type="dxa" w:w="2256"/>
           </w:tcPr>
           <w:p>
             <w:pPr>
@@ -778,13 +740,13 @@
                 <w:rFonts w:ascii="宋体" w:hAnsi="宋体" w:eastAsia="宋体"/>
                 <w:sz w:val="20"/>
               </w:rPr>
-              <w:t>1个</w:t>
+              <w:t>1</w:t>
             </w:r>
           </w:p>
         </w:tc>
         <w:tc>
           <w:tcPr>
-            <w:tcW w:type="dxa" w:w="2268"/>
+            <w:tcW w:type="dxa" w:w="2256"/>
           </w:tcPr>
           <w:p>
             <w:pPr>
@@ -796,81 +758,7 @@
                 <w:rFonts w:ascii="宋体" w:hAnsi="宋体" w:eastAsia="宋体"/>
                 <w:sz w:val="20"/>
               </w:rPr>
-              <w:t>蓝莓种植规模</w:t>
-            </w:r>
-          </w:p>
-        </w:tc>
-      </w:tr>
-      <w:tr>
-        <w:tc>
-          <w:tcPr>
-            <w:tcW w:type="dxa" w:w="2268"/>
-          </w:tcPr>
-          <w:p>
-            <w:pPr>
-              <w:jc w:val="center"/>
-            </w:pPr>
-            <w:r/>
-            <w:r>
-              <w:rPr>
-                <w:rFonts w:ascii="宋体" w:hAnsi="宋体" w:eastAsia="宋体"/>
-                <w:sz w:val="20"/>
-              </w:rPr>
-              <w:t>目标变量</w:t>
-            </w:r>
-          </w:p>
-        </w:tc>
-        <w:tc>
-          <w:tcPr>
-            <w:tcW w:type="dxa" w:w="2268"/>
-          </w:tcPr>
-          <w:p>
-            <w:pPr>
-              <w:jc w:val="center"/>
-            </w:pPr>
-            <w:r/>
-            <w:r>
-              <w:rPr>
-                <w:rFonts w:ascii="宋体" w:hAnsi="宋体" w:eastAsia="宋体"/>
-                <w:sz w:val="20"/>
-              </w:rPr>
-              <w:t>yield</w:t>
-            </w:r>
-          </w:p>
-        </w:tc>
-        <w:tc>
-          <w:tcPr>
-            <w:tcW w:type="dxa" w:w="2268"/>
-          </w:tcPr>
-          <w:p>
-            <w:pPr>
-              <w:jc w:val="center"/>
-            </w:pPr>
-            <w:r/>
-            <w:r>
-              <w:rPr>
-                <w:rFonts w:ascii="宋体" w:hAnsi="宋体" w:eastAsia="宋体"/>
-                <w:sz w:val="20"/>
-              </w:rPr>
-              <w:t>1个</w:t>
-            </w:r>
-          </w:p>
-        </w:tc>
-        <w:tc>
-          <w:tcPr>
-            <w:tcW w:type="dxa" w:w="2268"/>
-          </w:tcPr>
-          <w:p>
-            <w:pPr>
-              <w:jc w:val="center"/>
-            </w:pPr>
-            <w:r/>
-            <w:r>
-              <w:rPr>
-                <w:rFonts w:ascii="宋体" w:hAnsi="宋体" w:eastAsia="宋体"/>
-                <w:sz w:val="20"/>
-              </w:rPr>
-              <w:t>蓝莓产量（预测目标）</w:t>
+              <w:t>种植规模</w:t>
             </w:r>
           </w:p>
         </w:tc>
@@ -882,7 +770,7 @@
         <w:pStyle w:val="Heading1"/>
       </w:pPr>
       <w:r>
-        <w:t>二、任务设计</w:t>
+        <w:t>三、任务设计</w:t>
       </w:r>
     </w:p>
     <w:p>
@@ -890,12 +778,12 @@
         <w:pStyle w:val="Heading2"/>
       </w:pPr>
       <w:r>
-        <w:t>2.1 数据预处理设计</w:t>
+        <w:t>3.1 数据预处理</w:t>
       </w:r>
     </w:p>
     <w:p>
       <w:pPr>
-        <w:spacing w:line="360" w:lineRule="auto" w:after="120"/>
+        <w:spacing w:after="80"/>
         <w:ind w:firstLine="480"/>
       </w:pPr>
       <w:r>
@@ -904,7 +792,7 @@
           <w:b w:val="0"/>
           <w:sz w:val="24"/>
         </w:rPr>
-        <w:t>数据预处理流水线包含四个步骤：(1) 缺失值检查与处理，确保数据完整性；(2) 特征与目标变量分离，将17个特征列作为自变量X，yield作为因变量y；(3) 训练验证集划分，按8:2比例随机分割（random_state=42保证可复现）；(4) StandardScaler标准化处理，将各特征转换为均值为0、标准差为1的标准正态分布，消除不同特征间的量纲差异，避免基于距离或梯度的算法受特征尺度影响。</w:t>
+        <w:t>缺失值检查（无缺失）、去重、特征/目标分离、StandardScaler标准化、8:2训练验证划分（random_state=42）。</w:t>
       </w:r>
     </w:p>
     <w:p>
@@ -912,12 +800,12 @@
         <w:pStyle w:val="Heading2"/>
       </w:pPr>
       <w:r>
-        <w:t>2.2 特征工程</w:t>
+        <w:t>3.2 探索性数据分析 (EDA)</w:t>
       </w:r>
     </w:p>
     <w:p>
       <w:pPr>
-        <w:spacing w:line="360" w:lineRule="auto" w:after="120"/>
+        <w:spacing w:after="80"/>
         <w:ind w:firstLine="480"/>
       </w:pPr>
       <w:r>
@@ -926,12 +814,73 @@
           <w:b w:val="0"/>
           <w:sz w:val="24"/>
         </w:rPr>
-        <w:t>相关性分析：计算所有特征与yield的Pearson相关系数，绘制相关性热力图，直观识别与产量最相关的变量。相关系数越大（绝对值接近1），表明线性关系越强。</w:t>
+        <w:t>下图展示了16个特征与yield的相关性热力图。果实特征(fruitset/seeds/fruitmass)与yield相关系数&gt;0.8，构成"强相关三角"，是典型的数据泄露信号：这些指标在收获前无法获知，不能用作预测特征。</w:t>
       </w:r>
     </w:p>
     <w:p>
       <w:pPr>
-        <w:spacing w:line="360" w:lineRule="auto" w:after="120"/>
+        <w:jc w:val="center"/>
+      </w:pPr>
+      <w:r>
+        <w:drawing>
+          <wp:inline xmlns:a="http://schemas.openxmlformats.org/drawingml/2006/main" xmlns:pic="http://schemas.openxmlformats.org/drawingml/2006/picture">
+            <wp:extent cx="5029200" cy="4580827"/>
+            <wp:docPr id="1" name="Picture 1"/>
+            <wp:cNvGraphicFramePr>
+              <a:graphicFrameLocks noChangeAspect="1"/>
+            </wp:cNvGraphicFramePr>
+            <a:graphic>
+              <a:graphicData uri="http://schemas.openxmlformats.org/drawingml/2006/picture">
+                <pic:pic>
+                  <pic:nvPicPr>
+                    <pic:cNvPr id="0" name="correlation_heatmap.png"/>
+                    <pic:cNvPicPr/>
+                  </pic:nvPicPr>
+                  <pic:blipFill>
+                    <a:blip r:embed="rId9"/>
+                    <a:stretch>
+                      <a:fillRect/>
+                    </a:stretch>
+                  </pic:blipFill>
+                  <pic:spPr>
+                    <a:xfrm>
+                      <a:off x="0" y="0"/>
+                      <a:ext cx="5029200" cy="4580827"/>
+                    </a:xfrm>
+                    <a:prstGeom prst="rect"/>
+                  </pic:spPr>
+                </pic:pic>
+              </a:graphicData>
+            </a:graphic>
+          </wp:inline>
+        </w:drawing>
+      </w:r>
+    </w:p>
+    <w:p>
+      <w:pPr>
+        <w:spacing w:after="280"/>
+        <w:jc w:val="center"/>
+      </w:pPr>
+      <w:r>
+        <w:rPr>
+          <w:rFonts w:ascii="宋体" w:hAnsi="宋体" w:eastAsia="宋体"/>
+          <w:b/>
+          <w:sz w:val="20"/>
+        </w:rPr>
+        <w:t>图1：特征相关性热力图（果实特征三变量与yield高度共线）</w:t>
+      </w:r>
+    </w:p>
+    <w:p>
+      <w:pPr>
+        <w:pStyle w:val="Heading2"/>
+      </w:pPr>
+      <w:r>
+        <w:t>3.3 特征工程</w:t>
+      </w:r>
+    </w:p>
+    <w:p>
+      <w:pPr>
+        <w:spacing w:after="80"/>
         <w:ind w:firstLine="480"/>
       </w:pPr>
       <w:r>
@@ -940,12 +889,73 @@
           <w:b w:val="0"/>
           <w:sz w:val="24"/>
         </w:rPr>
-        <w:t>PCA降维：对高维特征空间进行主成分分析（Principal Component Analysis），设置方差保留阈值为95%，在降低特征维度、缓解多重共线性的同时保留绝大多数信息量。同时将数据降至2维用于聚类结果的可视化展示。</w:t>
+        <w:t>PCA降维（保留95%方差）：全特征17维→7维，排除果实特征13维→6维，有效消除多重共线性（原始16特征中10个VIF&gt;10，降维后全部消除）。</w:t>
       </w:r>
     </w:p>
     <w:p>
       <w:pPr>
-        <w:spacing w:line="360" w:lineRule="auto" w:after="120"/>
+        <w:jc w:val="center"/>
+      </w:pPr>
+      <w:r>
+        <w:drawing>
+          <wp:inline xmlns:a="http://schemas.openxmlformats.org/drawingml/2006/main" xmlns:pic="http://schemas.openxmlformats.org/drawingml/2006/picture">
+            <wp:extent cx="4754880" cy="2475624"/>
+            <wp:docPr id="2" name="Picture 2"/>
+            <wp:cNvGraphicFramePr>
+              <a:graphicFrameLocks noChangeAspect="1"/>
+            </wp:cNvGraphicFramePr>
+            <a:graphic>
+              <a:graphicData uri="http://schemas.openxmlformats.org/drawingml/2006/picture">
+                <pic:pic>
+                  <pic:nvPicPr>
+                    <pic:cNvPr id="0" name="pca_variance.png"/>
+                    <pic:cNvPicPr/>
+                  </pic:nvPicPr>
+                  <pic:blipFill>
+                    <a:blip r:embed="rId10"/>
+                    <a:stretch>
+                      <a:fillRect/>
+                    </a:stretch>
+                  </pic:blipFill>
+                  <pic:spPr>
+                    <a:xfrm>
+                      <a:off x="0" y="0"/>
+                      <a:ext cx="4754880" cy="2475624"/>
+                    </a:xfrm>
+                    <a:prstGeom prst="rect"/>
+                  </pic:spPr>
+                </pic:pic>
+              </a:graphicData>
+            </a:graphic>
+          </wp:inline>
+        </w:drawing>
+      </w:r>
+    </w:p>
+    <w:p>
+      <w:pPr>
+        <w:spacing w:after="280"/>
+        <w:jc w:val="center"/>
+      </w:pPr>
+      <w:r>
+        <w:rPr>
+          <w:rFonts w:ascii="宋体" w:hAnsi="宋体" w:eastAsia="宋体"/>
+          <w:b/>
+          <w:sz w:val="20"/>
+        </w:rPr>
+        <w:t>图2：PCA主成分解释方差分析（95%阈值线）</w:t>
+      </w:r>
+    </w:p>
+    <w:p>
+      <w:pPr>
+        <w:pStyle w:val="Heading2"/>
+      </w:pPr>
+      <w:r>
+        <w:t>3.4 模型设计</w:t>
+      </w:r>
+    </w:p>
+    <w:p>
+      <w:pPr>
+        <w:spacing w:after="80"/>
         <w:ind w:firstLine="480"/>
       </w:pPr>
       <w:r>
@@ -954,12 +964,12 @@
           <w:b w:val="0"/>
           <w:sz w:val="24"/>
         </w:rPr>
-        <w:t>VIF诊断：计算各特征的方差膨胀因子（Variance Inflation Factor），以VIF &gt; 10为严重共线性的判定阈值，为特征筛选提供定量依据。VIF越大，表明该特征可被其他特征线性表示的程度越高。</w:t>
+        <w:t>K-Means聚类：肘部法则+轮廓系数+DB指数+CH分数四指标综合选最优K。</w:t>
       </w:r>
     </w:p>
     <w:p>
       <w:pPr>
-        <w:spacing w:line="360" w:lineRule="auto" w:after="120"/>
+        <w:spacing w:after="80"/>
         <w:ind w:firstLine="480"/>
       </w:pPr>
       <w:r>
@@ -968,20 +978,12 @@
           <w:b w:val="0"/>
           <w:sz w:val="24"/>
         </w:rPr>
-        <w:t>果实特征对照实验（核心创新点）：这是项目最重要的实验设计。分别使用「全部特征（18个）」和「排除果实特征（15个，去掉fruitset/fruitmass/seeds）」两组特征集进行建模对比。果实特征与yield高度共线（相关系数R &gt; 0.8），包含它们相当于用"种植后的结果"来预测"产量"——这是典型的"数据泄露"（Data Leakage）。排除果实特征后R²会下降，但模型更加合理可信，因为只用种植前可干预的环境变量做预测，符合产量预测的实际应用场景。</w:t>
+        <w:t>线性回归：RidgeCV+LassoCV交叉验证自动选alpha，双轨对照（全特征 vs 排除果实）。</w:t>
       </w:r>
     </w:p>
     <w:p>
       <w:pPr>
-        <w:pStyle w:val="Heading2"/>
-      </w:pPr>
-      <w:r>
-        <w:t>2.3 模型设计</w:t>
-      </w:r>
-    </w:p>
-    <w:p>
-      <w:pPr>
-        <w:spacing w:line="360" w:lineRule="auto" w:after="120"/>
+        <w:spacing w:after="80"/>
         <w:ind w:firstLine="480"/>
       </w:pPr>
       <w:r>
@@ -990,12 +992,20 @@
           <w:b w:val="0"/>
           <w:sz w:val="24"/>
         </w:rPr>
-        <w:t>K-Means聚类：通过肘部法则（Elbow Method）观察惯性值（Inertia）随K值变化的拐点，结合轮廓系数（Silhouette Score）确定最优聚类数K。将蓝莓种植环境样本进行无监督分组，PCA降维至2维后通过散点图可视化聚类结果，并对各簇进行特征偏离解读，分析高产与低产环境的关键差异。</w:t>
+        <w:t>随机森林：200棵树+排列重要性+学习曲线+交叉验证。</w:t>
       </w:r>
     </w:p>
     <w:p>
       <w:pPr>
-        <w:spacing w:line="360" w:lineRule="auto" w:after="120"/>
+        <w:pStyle w:val="Heading1"/>
+      </w:pPr>
+      <w:r>
+        <w:t>四、任务实现</w:t>
+      </w:r>
+    </w:p>
+    <w:p>
+      <w:pPr>
+        <w:spacing w:after="80"/>
         <w:ind w:firstLine="480"/>
       </w:pPr>
       <w:r>
@@ -1004,12 +1014,12 @@
           <w:b w:val="0"/>
           <w:sz w:val="24"/>
         </w:rPr>
-        <w:t>线性回归（Ridge + Lasso）：Ridge回归使用L2正则化项，通过惩罚大系数来防止过拟合；Lasso回归使用L1正则化项，可将不重要的特征系数压缩至零，实现自动特征选择。两者均在PCA降维后的特征上进行训练，通过RidgeCV和LassoCV内置的交叉验证自动选择最优正则化强度alpha。</w:t>
+        <w:t>系统采用模块化架构：config(配置)→data(加载/预处理)→features(降维/特征构造)→models(聚类/回归/评估)→visualization(图表)→pipeline(编排)→main(CLI入口)。</w:t>
       </w:r>
     </w:p>
     <w:p>
       <w:pPr>
-        <w:spacing w:line="360" w:lineRule="auto" w:after="120"/>
+        <w:spacing w:after="80"/>
         <w:ind w:firstLine="480"/>
       </w:pPr>
       <w:r>
@@ -1018,12 +1028,28 @@
           <w:b w:val="0"/>
           <w:sz w:val="24"/>
         </w:rPr>
-        <w:t>随机森林：使用RandomForestRegressor集成模型，构建200棵决策树（n_estimators=200），每棵树在随机采样的数据和特征子集上训练，通过Bagging策略聚合预测结果，有效降低方差防止过拟合。基于排除果实特征后的15个环境变量训练，输出特征重要性排序。</w:t>
+        <w:t>支持命令行参数：--mode full/train/predict、--tune 启用网格搜索、--no-save 禁用模型持久化。</w:t>
       </w:r>
     </w:p>
     <w:p>
       <w:pPr>
-        <w:spacing w:line="360" w:lineRule="auto" w:after="120"/>
+        <w:pStyle w:val="Heading1"/>
+      </w:pPr>
+      <w:r>
+        <w:t>五、任务测试与结果</w:t>
+      </w:r>
+    </w:p>
+    <w:p>
+      <w:pPr>
+        <w:pStyle w:val="Heading2"/>
+      </w:pPr>
+      <w:r>
+        <w:t>5.1 聚类分析</w:t>
+      </w:r>
+    </w:p>
+    <w:p>
+      <w:pPr>
+        <w:spacing w:after="80"/>
         <w:ind w:firstLine="480"/>
       </w:pPr>
       <w:r>
@@ -1032,28 +1058,118 @@
           <w:b w:val="0"/>
           <w:sz w:val="24"/>
         </w:rPr>
-        <w:t>评估指标：R²（决定系数）衡量模型对目标变量方差的解释比例，越接近1越好；RMSE（均方根误差）衡量预测值与真实值的平均偏差幅度，与目标变量同单位；MAE（平均绝对误差）衡量预测偏差的绝对幅度，对异常值不敏感。</w:t>
+        <w:t>聚类质量三指标综合评分，最优K=2。PCA二维投影散点图展示了自然的群体划分。</w:t>
       </w:r>
     </w:p>
     <w:p>
       <w:pPr>
-        <w:pStyle w:val="Heading1"/>
+        <w:jc w:val="center"/>
       </w:pPr>
       <w:r>
-        <w:t>三、任务实现</w:t>
+        <w:drawing>
+          <wp:inline xmlns:a="http://schemas.openxmlformats.org/drawingml/2006/main" xmlns:pic="http://schemas.openxmlformats.org/drawingml/2006/picture">
+            <wp:extent cx="5029200" cy="1388785"/>
+            <wp:docPr id="3" name="Picture 3"/>
+            <wp:cNvGraphicFramePr>
+              <a:graphicFrameLocks noChangeAspect="1"/>
+            </wp:cNvGraphicFramePr>
+            <a:graphic>
+              <a:graphicData uri="http://schemas.openxmlformats.org/drawingml/2006/picture">
+                <pic:pic>
+                  <pic:nvPicPr>
+                    <pic:cNvPr id="0" name="cluster_metrics.png"/>
+                    <pic:cNvPicPr/>
+                  </pic:nvPicPr>
+                  <pic:blipFill>
+                    <a:blip r:embed="rId11"/>
+                    <a:stretch>
+                      <a:fillRect/>
+                    </a:stretch>
+                  </pic:blipFill>
+                  <pic:spPr>
+                    <a:xfrm>
+                      <a:off x="0" y="0"/>
+                      <a:ext cx="5029200" cy="1388785"/>
+                    </a:xfrm>
+                    <a:prstGeom prst="rect"/>
+                  </pic:spPr>
+                </pic:pic>
+              </a:graphicData>
+            </a:graphic>
+          </wp:inline>
+        </w:drawing>
       </w:r>
     </w:p>
     <w:p>
       <w:pPr>
-        <w:pStyle w:val="Heading2"/>
+        <w:spacing w:after="280"/>
+        <w:jc w:val="center"/>
       </w:pPr>
       <w:r>
-        <w:t>3.1 工程代码结构</w:t>
+        <w:rPr>
+          <w:rFonts w:ascii="宋体" w:hAnsi="宋体" w:eastAsia="宋体"/>
+          <w:b/>
+          <w:sz w:val="20"/>
+        </w:rPr>
+        <w:t>图3：聚类质量指标（轮廓系数/DB指数/CH分数）随K值变化</w:t>
       </w:r>
     </w:p>
     <w:p>
       <w:pPr>
-        <w:spacing w:line="360" w:lineRule="auto" w:after="120"/>
+        <w:jc w:val="center"/>
+      </w:pPr>
+      <w:r>
+        <w:drawing>
+          <wp:inline xmlns:a="http://schemas.openxmlformats.org/drawingml/2006/main" xmlns:pic="http://schemas.openxmlformats.org/drawingml/2006/picture">
+            <wp:extent cx="4114800" cy="3388416"/>
+            <wp:docPr id="4" name="Picture 4"/>
+            <wp:cNvGraphicFramePr>
+              <a:graphicFrameLocks noChangeAspect="1"/>
+            </wp:cNvGraphicFramePr>
+            <a:graphic>
+              <a:graphicData uri="http://schemas.openxmlformats.org/drawingml/2006/picture">
+                <pic:pic>
+                  <pic:nvPicPr>
+                    <pic:cNvPr id="0" name="cluster_scatter.png"/>
+                    <pic:cNvPicPr/>
+                  </pic:nvPicPr>
+                  <pic:blipFill>
+                    <a:blip r:embed="rId12"/>
+                    <a:stretch>
+                      <a:fillRect/>
+                    </a:stretch>
+                  </pic:blipFill>
+                  <pic:spPr>
+                    <a:xfrm>
+                      <a:off x="0" y="0"/>
+                      <a:ext cx="4114800" cy="3388416"/>
+                    </a:xfrm>
+                    <a:prstGeom prst="rect"/>
+                  </pic:spPr>
+                </pic:pic>
+              </a:graphicData>
+            </a:graphic>
+          </wp:inline>
+        </w:drawing>
+      </w:r>
+    </w:p>
+    <w:p>
+      <w:pPr>
+        <w:spacing w:after="280"/>
+        <w:jc w:val="center"/>
+      </w:pPr>
+      <w:r>
+        <w:rPr>
+          <w:rFonts w:ascii="宋体" w:hAnsi="宋体" w:eastAsia="宋体"/>
+          <w:b/>
+          <w:sz w:val="20"/>
+        </w:rPr>
+        <w:t>图4：PCA二维投影聚类散点图</w:t>
+      </w:r>
+    </w:p>
+    <w:p>
+      <w:pPr>
+        <w:spacing w:after="80"/>
         <w:ind w:firstLine="480"/>
       </w:pPr>
       <w:r>
@@ -1062,7 +1178,132 @@
           <w:b w:val="0"/>
           <w:sz w:val="24"/>
         </w:rPr>
-        <w:t>工程项目采用模块化架构设计，按数据处理、特征工程、模型训练、可视化等功能拆分为独立模块，各模块职责清晰、可独立测试和维护。核心代码文件结构如下：</w:t>
+        <w:t>雷达图展示了两类种植环境在各特征维度上的归一化差异，可供种植管理做差异化决策参考。</w:t>
+      </w:r>
+    </w:p>
+    <w:p>
+      <w:pPr>
+        <w:jc w:val="center"/>
+      </w:pPr>
+      <w:r>
+        <w:drawing>
+          <wp:inline xmlns:a="http://schemas.openxmlformats.org/drawingml/2006/main" xmlns:pic="http://schemas.openxmlformats.org/drawingml/2006/picture">
+            <wp:extent cx="4572000" cy="3724918"/>
+            <wp:docPr id="5" name="Picture 5"/>
+            <wp:cNvGraphicFramePr>
+              <a:graphicFrameLocks noChangeAspect="1"/>
+            </wp:cNvGraphicFramePr>
+            <a:graphic>
+              <a:graphicData uri="http://schemas.openxmlformats.org/drawingml/2006/picture">
+                <pic:pic>
+                  <pic:nvPicPr>
+                    <pic:cNvPr id="0" name="cluster_radar.png"/>
+                    <pic:cNvPicPr/>
+                  </pic:nvPicPr>
+                  <pic:blipFill>
+                    <a:blip r:embed="rId13"/>
+                    <a:stretch>
+                      <a:fillRect/>
+                    </a:stretch>
+                  </pic:blipFill>
+                  <pic:spPr>
+                    <a:xfrm>
+                      <a:off x="0" y="0"/>
+                      <a:ext cx="4572000" cy="3724918"/>
+                    </a:xfrm>
+                    <a:prstGeom prst="rect"/>
+                  </pic:spPr>
+                </pic:pic>
+              </a:graphicData>
+            </a:graphic>
+          </wp:inline>
+        </w:drawing>
+      </w:r>
+    </w:p>
+    <w:p>
+      <w:pPr>
+        <w:spacing w:after="280"/>
+        <w:jc w:val="center"/>
+      </w:pPr>
+      <w:r>
+        <w:rPr>
+          <w:rFonts w:ascii="宋体" w:hAnsi="宋体" w:eastAsia="宋体"/>
+          <w:b/>
+          <w:sz w:val="20"/>
+        </w:rPr>
+        <w:t>图5：聚类画像雷达图（归一化特征均值对比）</w:t>
+      </w:r>
+    </w:p>
+    <w:p>
+      <w:pPr>
+        <w:pStyle w:val="Heading2"/>
+      </w:pPr>
+      <w:r>
+        <w:t>5.2 果实特征对照实验（核心创新点）</w:t>
+      </w:r>
+    </w:p>
+    <w:p>
+      <w:pPr>
+        <w:spacing w:after="80"/>
+        <w:ind w:firstLine="480"/>
+      </w:pPr>
+      <w:r>
+        <w:rPr>
+          <w:rFonts w:ascii="宋体" w:hAnsi="宋体" w:eastAsia="宋体"/>
+          <w:b w:val="0"/>
+          <w:sz w:val="24"/>
+        </w:rPr>
+        <w:t>这是项目最重要的实验设计。分别在两种特征组合上训练Ridge/Lasso回归：</w:t>
+      </w:r>
+    </w:p>
+    <w:p>
+      <w:pPr>
+        <w:spacing w:after="80"/>
+        <w:ind w:firstLine="480"/>
+      </w:pPr>
+      <w:r>
+        <w:rPr>
+          <w:rFonts w:ascii="宋体" w:hAnsi="宋体" w:eastAsia="宋体"/>
+          <w:b w:val="0"/>
+          <w:sz w:val="24"/>
+        </w:rPr>
+        <w:t>方案A（全部17特征）：R²=0.7843，RMSE=615.8。表现看似优秀，但果实特征(fruitset/fruitmass/seeds)是收获后才能观测的"结果变量"，用它们预测产量构成数据泄露（Data Leakage）。</w:t>
+      </w:r>
+    </w:p>
+    <w:p>
+      <w:pPr>
+        <w:spacing w:after="80"/>
+        <w:ind w:firstLine="480"/>
+      </w:pPr>
+      <w:r>
+        <w:rPr>
+          <w:rFonts w:ascii="宋体" w:hAnsi="宋体" w:eastAsia="宋体"/>
+          <w:b w:val="0"/>
+          <w:sz w:val="24"/>
+        </w:rPr>
+        <w:t>方案B（排除果实特征，13特征）：R²=0.3279，RMSE=1087.0。预测力虽有下降，但模型逻辑自洽——只用种植前可干预的环境变量做预测。</w:t>
+      </w:r>
+    </w:p>
+    <w:p>
+      <w:pPr>
+        <w:spacing w:after="80"/>
+        <w:ind w:firstLine="480"/>
+      </w:pPr>
+      <w:r>
+        <w:rPr>
+          <w:rFonts w:ascii="宋体" w:hAnsi="宋体" w:eastAsia="宋体"/>
+          <w:b w:val="0"/>
+          <w:sz w:val="24"/>
+        </w:rPr>
+        <w:t>R²下降0.457，直观量化了果实特征的"信息含量"，也印证了"高R²不等于好模型"的核心原则。</w:t>
+      </w:r>
+    </w:p>
+    <w:p>
+      <w:pPr>
+        <w:pStyle w:val="Heading2"/>
+      </w:pPr>
+      <w:r>
+        <w:t>5.3 模型对比</w:t>
       </w:r>
     </w:p>
     <w:tbl>
@@ -1073,606 +1314,16 @@
         <w:tblLook w:firstColumn="1" w:firstRow="1" w:lastColumn="0" w:lastRow="0" w:noHBand="0" w:noVBand="1" w:val="04A0"/>
       </w:tblPr>
       <w:tblGrid>
-        <w:gridCol w:w="4536"/>
-        <w:gridCol w:w="4536"/>
+        <w:gridCol w:w="1805"/>
+        <w:gridCol w:w="1805"/>
+        <w:gridCol w:w="1805"/>
+        <w:gridCol w:w="1805"/>
+        <w:gridCol w:w="1805"/>
       </w:tblGrid>
       <w:tr>
         <w:tc>
           <w:tcPr>
-            <w:tcW w:type="dxa" w:w="4536"/>
-            <w:shd w:fill="D9E2F3" w:val="clear"/>
-          </w:tcPr>
-          <w:p>
-            <w:pPr>
-              <w:jc w:val="center"/>
-            </w:pPr>
-            <w:r/>
-            <w:r>
-              <w:rPr>
-                <w:rFonts w:ascii="黑体" w:hAnsi="黑体" w:eastAsia="黑体"/>
-                <w:b/>
-                <w:sz w:val="20"/>
-              </w:rPr>
-              <w:t>目录/文件</w:t>
-            </w:r>
-          </w:p>
-        </w:tc>
-        <w:tc>
-          <w:tcPr>
-            <w:tcW w:type="dxa" w:w="4536"/>
-            <w:shd w:fill="D9E2F3" w:val="clear"/>
-          </w:tcPr>
-          <w:p>
-            <w:pPr>
-              <w:jc w:val="center"/>
-            </w:pPr>
-            <w:r/>
-            <w:r>
-              <w:rPr>
-                <w:rFonts w:ascii="黑体" w:hAnsi="黑体" w:eastAsia="黑体"/>
-                <w:b/>
-                <w:sz w:val="20"/>
-              </w:rPr>
-              <w:t>功能说明</w:t>
-            </w:r>
-          </w:p>
-        </w:tc>
-      </w:tr>
-      <w:tr>
-        <w:tc>
-          <w:tcPr>
-            <w:tcW w:type="dxa" w:w="4536"/>
-          </w:tcPr>
-          <w:p>
-            <w:pPr>
-              <w:jc w:val="center"/>
-            </w:pPr>
-            <w:r/>
-            <w:r>
-              <w:rPr>
-                <w:rFonts w:ascii="宋体" w:hAnsi="宋体" w:eastAsia="宋体"/>
-                <w:sz w:val="20"/>
-              </w:rPr>
-              <w:t>main.py</w:t>
-            </w:r>
-          </w:p>
-        </w:tc>
-        <w:tc>
-          <w:tcPr>
-            <w:tcW w:type="dxa" w:w="4536"/>
-          </w:tcPr>
-          <w:p>
-            <w:pPr>
-              <w:jc w:val="center"/>
-            </w:pPr>
-            <w:r/>
-            <w:r>
-              <w:rPr>
-                <w:rFonts w:ascii="宋体" w:hAnsi="宋体" w:eastAsia="宋体"/>
-                <w:sz w:val="20"/>
-              </w:rPr>
-              <w:t>全流程主脚本，串联从数据加载到测试集预测的所有步骤</w:t>
-            </w:r>
-          </w:p>
-        </w:tc>
-      </w:tr>
-      <w:tr>
-        <w:tc>
-          <w:tcPr>
-            <w:tcW w:type="dxa" w:w="4536"/>
-          </w:tcPr>
-          <w:p>
-            <w:pPr>
-              <w:jc w:val="center"/>
-            </w:pPr>
-            <w:r/>
-            <w:r>
-              <w:rPr>
-                <w:rFonts w:ascii="宋体" w:hAnsi="宋体" w:eastAsia="宋体"/>
-                <w:sz w:val="20"/>
-              </w:rPr>
-              <w:t>src/config.py</w:t>
-            </w:r>
-          </w:p>
-        </w:tc>
-        <w:tc>
-          <w:tcPr>
-            <w:tcW w:type="dxa" w:w="4536"/>
-          </w:tcPr>
-          <w:p>
-            <w:pPr>
-              <w:jc w:val="center"/>
-            </w:pPr>
-            <w:r/>
-            <w:r>
-              <w:rPr>
-                <w:rFonts w:ascii="宋体" w:hAnsi="宋体" w:eastAsia="宋体"/>
-                <w:sz w:val="20"/>
-              </w:rPr>
-              <w:t>全局配置文件：数据路径、特征分组列表、随机种子</w:t>
-            </w:r>
-          </w:p>
-        </w:tc>
-      </w:tr>
-      <w:tr>
-        <w:tc>
-          <w:tcPr>
-            <w:tcW w:type="dxa" w:w="4536"/>
-          </w:tcPr>
-          <w:p>
-            <w:pPr>
-              <w:jc w:val="center"/>
-            </w:pPr>
-            <w:r/>
-            <w:r>
-              <w:rPr>
-                <w:rFonts w:ascii="宋体" w:hAnsi="宋体" w:eastAsia="宋体"/>
-                <w:sz w:val="20"/>
-              </w:rPr>
-              <w:t>src/data/loader.py</w:t>
-            </w:r>
-          </w:p>
-        </w:tc>
-        <w:tc>
-          <w:tcPr>
-            <w:tcW w:type="dxa" w:w="4536"/>
-          </w:tcPr>
-          <w:p>
-            <w:pPr>
-              <w:jc w:val="center"/>
-            </w:pPr>
-            <w:r/>
-            <w:r>
-              <w:rPr>
-                <w:rFonts w:ascii="宋体" w:hAnsi="宋体" w:eastAsia="宋体"/>
-                <w:sz w:val="20"/>
-              </w:rPr>
-              <w:t>CSV数据加载模块，读取训练集和测试集</w:t>
-            </w:r>
-          </w:p>
-        </w:tc>
-      </w:tr>
-      <w:tr>
-        <w:tc>
-          <w:tcPr>
-            <w:tcW w:type="dxa" w:w="4536"/>
-          </w:tcPr>
-          <w:p>
-            <w:pPr>
-              <w:jc w:val="center"/>
-            </w:pPr>
-            <w:r/>
-            <w:r>
-              <w:rPr>
-                <w:rFonts w:ascii="宋体" w:hAnsi="宋体" w:eastAsia="宋体"/>
-                <w:sz w:val="20"/>
-              </w:rPr>
-              <w:t>src/data/preprocessor.py</w:t>
-            </w:r>
-          </w:p>
-        </w:tc>
-        <w:tc>
-          <w:tcPr>
-            <w:tcW w:type="dxa" w:w="4536"/>
-          </w:tcPr>
-          <w:p>
-            <w:pPr>
-              <w:jc w:val="center"/>
-            </w:pPr>
-            <w:r/>
-            <w:r>
-              <w:rPr>
-                <w:rFonts w:ascii="宋体" w:hAnsi="宋体" w:eastAsia="宋体"/>
-                <w:sz w:val="20"/>
-              </w:rPr>
-              <w:t>数据预处理：缺失值处理、训练验证划分、标准化</w:t>
-            </w:r>
-          </w:p>
-        </w:tc>
-      </w:tr>
-      <w:tr>
-        <w:tc>
-          <w:tcPr>
-            <w:tcW w:type="dxa" w:w="4536"/>
-          </w:tcPr>
-          <w:p>
-            <w:pPr>
-              <w:jc w:val="center"/>
-            </w:pPr>
-            <w:r/>
-            <w:r>
-              <w:rPr>
-                <w:rFonts w:ascii="宋体" w:hAnsi="宋体" w:eastAsia="宋体"/>
-                <w:sz w:val="20"/>
-              </w:rPr>
-              <w:t>src/features/engineering.py</w:t>
-            </w:r>
-          </w:p>
-        </w:tc>
-        <w:tc>
-          <w:tcPr>
-            <w:tcW w:type="dxa" w:w="4536"/>
-          </w:tcPr>
-          <w:p>
-            <w:pPr>
-              <w:jc w:val="center"/>
-            </w:pPr>
-            <w:r/>
-            <w:r>
-              <w:rPr>
-                <w:rFonts w:ascii="宋体" w:hAnsi="宋体" w:eastAsia="宋体"/>
-                <w:sz w:val="20"/>
-              </w:rPr>
-              <w:t>特征工程：PCA降维实现</w:t>
-            </w:r>
-          </w:p>
-        </w:tc>
-      </w:tr>
-      <w:tr>
-        <w:tc>
-          <w:tcPr>
-            <w:tcW w:type="dxa" w:w="4536"/>
-          </w:tcPr>
-          <w:p>
-            <w:pPr>
-              <w:jc w:val="center"/>
-            </w:pPr>
-            <w:r/>
-            <w:r>
-              <w:rPr>
-                <w:rFonts w:ascii="宋体" w:hAnsi="宋体" w:eastAsia="宋体"/>
-                <w:sz w:val="20"/>
-              </w:rPr>
-              <w:t>src/models/clustering.py</w:t>
-            </w:r>
-          </w:p>
-        </w:tc>
-        <w:tc>
-          <w:tcPr>
-            <w:tcW w:type="dxa" w:w="4536"/>
-          </w:tcPr>
-          <w:p>
-            <w:pPr>
-              <w:jc w:val="center"/>
-            </w:pPr>
-            <w:r/>
-            <w:r>
-              <w:rPr>
-                <w:rFonts w:ascii="宋体" w:hAnsi="宋体" w:eastAsia="宋体"/>
-                <w:sz w:val="20"/>
-              </w:rPr>
-              <w:t>K-Means聚类分析，含最优K值自动选择</w:t>
-            </w:r>
-          </w:p>
-        </w:tc>
-      </w:tr>
-      <w:tr>
-        <w:tc>
-          <w:tcPr>
-            <w:tcW w:type="dxa" w:w="4536"/>
-          </w:tcPr>
-          <w:p>
-            <w:pPr>
-              <w:jc w:val="center"/>
-            </w:pPr>
-            <w:r/>
-            <w:r>
-              <w:rPr>
-                <w:rFonts w:ascii="宋体" w:hAnsi="宋体" w:eastAsia="宋体"/>
-                <w:sz w:val="20"/>
-              </w:rPr>
-              <w:t>src/models/linear_regression.py</w:t>
-            </w:r>
-          </w:p>
-        </w:tc>
-        <w:tc>
-          <w:tcPr>
-            <w:tcW w:type="dxa" w:w="4536"/>
-          </w:tcPr>
-          <w:p>
-            <w:pPr>
-              <w:jc w:val="center"/>
-            </w:pPr>
-            <w:r/>
-            <w:r>
-              <w:rPr>
-                <w:rFonts w:ascii="宋体" w:hAnsi="宋体" w:eastAsia="宋体"/>
-                <w:sz w:val="20"/>
-              </w:rPr>
-              <w:t>Ridge/Lasso回归 + VIF多重共线性诊断</w:t>
-            </w:r>
-          </w:p>
-        </w:tc>
-      </w:tr>
-      <w:tr>
-        <w:tc>
-          <w:tcPr>
-            <w:tcW w:type="dxa" w:w="4536"/>
-          </w:tcPr>
-          <w:p>
-            <w:pPr>
-              <w:jc w:val="center"/>
-            </w:pPr>
-            <w:r/>
-            <w:r>
-              <w:rPr>
-                <w:rFonts w:ascii="宋体" w:hAnsi="宋体" w:eastAsia="宋体"/>
-                <w:sz w:val="20"/>
-              </w:rPr>
-              <w:t>src/models/random_forest.py</w:t>
-            </w:r>
-          </w:p>
-        </w:tc>
-        <w:tc>
-          <w:tcPr>
-            <w:tcW w:type="dxa" w:w="4536"/>
-          </w:tcPr>
-          <w:p>
-            <w:pPr>
-              <w:jc w:val="center"/>
-            </w:pPr>
-            <w:r/>
-            <w:r>
-              <w:rPr>
-                <w:rFonts w:ascii="宋体" w:hAnsi="宋体" w:eastAsia="宋体"/>
-                <w:sz w:val="20"/>
-              </w:rPr>
-              <w:t>随机森林模型训练、预测与特征重要性</w:t>
-            </w:r>
-          </w:p>
-        </w:tc>
-      </w:tr>
-      <w:tr>
-        <w:tc>
-          <w:tcPr>
-            <w:tcW w:type="dxa" w:w="4536"/>
-          </w:tcPr>
-          <w:p>
-            <w:pPr>
-              <w:jc w:val="center"/>
-            </w:pPr>
-            <w:r/>
-            <w:r>
-              <w:rPr>
-                <w:rFonts w:ascii="宋体" w:hAnsi="宋体" w:eastAsia="宋体"/>
-                <w:sz w:val="20"/>
-              </w:rPr>
-              <w:t>src/models/evaluation.py</w:t>
-            </w:r>
-          </w:p>
-        </w:tc>
-        <w:tc>
-          <w:tcPr>
-            <w:tcW w:type="dxa" w:w="4536"/>
-          </w:tcPr>
-          <w:p>
-            <w:pPr>
-              <w:jc w:val="center"/>
-            </w:pPr>
-            <w:r/>
-            <w:r>
-              <w:rPr>
-                <w:rFonts w:ascii="宋体" w:hAnsi="宋体" w:eastAsia="宋体"/>
-                <w:sz w:val="20"/>
-              </w:rPr>
-              <w:t>评估指标计算（R²/RMSE/MAE）与模型对比</w:t>
-            </w:r>
-          </w:p>
-        </w:tc>
-      </w:tr>
-      <w:tr>
-        <w:tc>
-          <w:tcPr>
-            <w:tcW w:type="dxa" w:w="4536"/>
-          </w:tcPr>
-          <w:p>
-            <w:pPr>
-              <w:jc w:val="center"/>
-            </w:pPr>
-            <w:r/>
-            <w:r>
-              <w:rPr>
-                <w:rFonts w:ascii="宋体" w:hAnsi="宋体" w:eastAsia="宋体"/>
-                <w:sz w:val="20"/>
-              </w:rPr>
-              <w:t>src/visualization/plots.py</w:t>
-            </w:r>
-          </w:p>
-        </w:tc>
-        <w:tc>
-          <w:tcPr>
-            <w:tcW w:type="dxa" w:w="4536"/>
-          </w:tcPr>
-          <w:p>
-            <w:pPr>
-              <w:jc w:val="center"/>
-            </w:pPr>
-            <w:r/>
-            <w:r>
-              <w:rPr>
-                <w:rFonts w:ascii="宋体" w:hAnsi="宋体" w:eastAsia="宋体"/>
-                <w:sz w:val="20"/>
-              </w:rPr>
-              <w:t>Matplotlib+Seaborn可视化，生成12种分析图表</w:t>
-            </w:r>
-          </w:p>
-        </w:tc>
-      </w:tr>
-      <w:tr>
-        <w:tc>
-          <w:tcPr>
-            <w:tcW w:type="dxa" w:w="4536"/>
-          </w:tcPr>
-          <w:p>
-            <w:pPr>
-              <w:jc w:val="center"/>
-            </w:pPr>
-            <w:r/>
-            <w:r>
-              <w:rPr>
-                <w:rFonts w:ascii="宋体" w:hAnsi="宋体" w:eastAsia="宋体"/>
-                <w:sz w:val="20"/>
-              </w:rPr>
-              <w:t>outputs/figures/</w:t>
-            </w:r>
-          </w:p>
-        </w:tc>
-        <w:tc>
-          <w:tcPr>
-            <w:tcW w:type="dxa" w:w="4536"/>
-          </w:tcPr>
-          <w:p>
-            <w:pPr>
-              <w:jc w:val="center"/>
-            </w:pPr>
-            <w:r/>
-            <w:r>
-              <w:rPr>
-                <w:rFonts w:ascii="宋体" w:hAnsi="宋体" w:eastAsia="宋体"/>
-                <w:sz w:val="20"/>
-              </w:rPr>
-              <w:t>输出图表保存目录</w:t>
-            </w:r>
-          </w:p>
-        </w:tc>
-      </w:tr>
-      <w:tr>
-        <w:tc>
-          <w:tcPr>
-            <w:tcW w:type="dxa" w:w="4536"/>
-          </w:tcPr>
-          <w:p>
-            <w:pPr>
-              <w:jc w:val="center"/>
-            </w:pPr>
-            <w:r/>
-            <w:r>
-              <w:rPr>
-                <w:rFonts w:ascii="宋体" w:hAnsi="宋体" w:eastAsia="宋体"/>
-                <w:sz w:val="20"/>
-              </w:rPr>
-              <w:t>outputs/models/</w:t>
-            </w:r>
-          </w:p>
-        </w:tc>
-        <w:tc>
-          <w:tcPr>
-            <w:tcW w:type="dxa" w:w="4536"/>
-          </w:tcPr>
-          <w:p>
-            <w:pPr>
-              <w:jc w:val="center"/>
-            </w:pPr>
-            <w:r/>
-            <w:r>
-              <w:rPr>
-                <w:rFonts w:ascii="宋体" w:hAnsi="宋体" w:eastAsia="宋体"/>
-                <w:sz w:val="20"/>
-              </w:rPr>
-              <w:t>模型预测结果（CSV）保存目录</w:t>
-            </w:r>
-          </w:p>
-        </w:tc>
-      </w:tr>
-    </w:tbl>
-    <w:p/>
-    <w:p>
-      <w:pPr>
-        <w:pStyle w:val="Heading2"/>
-      </w:pPr>
-      <w:r>
-        <w:t>3.2 核心算法实现说明</w:t>
-      </w:r>
-    </w:p>
-    <w:p>
-      <w:pPr>
-        <w:spacing w:line="360" w:lineRule="auto" w:after="120"/>
-        <w:ind w:firstLine="480"/>
-      </w:pPr>
-      <w:r>
-        <w:rPr>
-          <w:rFonts w:ascii="宋体" w:hAnsi="宋体" w:eastAsia="宋体"/>
-          <w:b w:val="0"/>
-          <w:sz w:val="24"/>
-        </w:rPr>
-        <w:t>K-Means聚类：使用sklearn.cluster.KMeans实现。核心参数为n_clusters（聚类数），通过循环K=2~10计算每种K值下的惯性值（模型内样本到簇中心的距离平方和）和轮廓系数（衡量样本与自身簇和其他簇的相似度差异），自动选择轮廓系数最高的K值作为最优聚类数。聚类完成后，使用PCA将17维特征降至2维，以散点图形式可视化聚类标签，直观展示样本分组效果。</w:t>
-      </w:r>
-    </w:p>
-    <w:p>
-      <w:pPr>
-        <w:spacing w:line="360" w:lineRule="auto" w:after="120"/>
-        <w:ind w:firstLine="480"/>
-      </w:pPr>
-      <w:r>
-        <w:rPr>
-          <w:rFonts w:ascii="宋体" w:hAnsi="宋体" w:eastAsia="宋体"/>
-          <w:b w:val="0"/>
-          <w:sz w:val="24"/>
-        </w:rPr>
-        <w:t>线性回归：先使用PCA（方差阈值0.95）对特征进行降维去相关处理，再将降维后的特征分别输入RidgeCV和LassoCV。两个CV类内部通过留一交叉验证或多折交叉验证自动搜索最优alpha值。训练完成后在20%验证集上使用regression_metrics函数计算R²、RMSE、MAE。使用statsmodels.api.OLS配合add_constant计算VIF值，诊断多重共线性。</w:t>
-      </w:r>
-    </w:p>
-    <w:p>
-      <w:pPr>
-        <w:spacing w:line="360" w:lineRule="auto" w:after="120"/>
-        <w:ind w:firstLine="480"/>
-      </w:pPr>
-      <w:r>
-        <w:rPr>
-          <w:rFonts w:ascii="宋体" w:hAnsi="宋体" w:eastAsia="宋体"/>
-          <w:b w:val="0"/>
-          <w:sz w:val="24"/>
-        </w:rPr>
-        <w:t>随机森林：使用sklearn.ensemble.RandomForestRegressor，设置n_estimators=200（决策树数量），random_state=42（保证结果可复现），其余参数使用默认值。训练完成后，通过feature_importances_属性获取每个特征对模型预测的贡献度（基于基尼不纯度或均方误差的减少量），按降序排序输出Top 5重要特征。</w:t>
-      </w:r>
-    </w:p>
-    <w:p>
-      <w:pPr>
-        <w:pStyle w:val="Heading1"/>
-      </w:pPr>
-      <w:r>
-        <w:t>四、任务测试与结果</w:t>
-      </w:r>
-    </w:p>
-    <w:p>
-      <w:pPr>
-        <w:pStyle w:val="Heading2"/>
-      </w:pPr>
-      <w:r>
-        <w:t>4.1 模型对比结果</w:t>
-      </w:r>
-    </w:p>
-    <w:p>
-      <w:pPr>
-        <w:spacing w:line="360" w:lineRule="auto" w:after="120"/>
-        <w:ind w:firstLine="480"/>
-      </w:pPr>
-      <w:r>
-        <w:rPr>
-          <w:rFonts w:ascii="宋体" w:hAnsi="宋体" w:eastAsia="宋体"/>
-          <w:b w:val="0"/>
-          <w:sz w:val="24"/>
-        </w:rPr>
-        <w:t>在验证集（20%训练数据）上对5种模型-特征组合方案进行了系统对比，结果如下表所示：</w:t>
-      </w:r>
-    </w:p>
-    <w:tbl>
-      <w:tblPr>
-        <w:tblStyle w:val="TableGrid"/>
-        <w:tblW w:type="auto" w:w="0"/>
-        <w:jc w:val="center"/>
-        <w:tblLook w:firstColumn="1" w:firstRow="1" w:lastColumn="0" w:lastRow="0" w:noHBand="0" w:noVBand="1" w:val="04A0"/>
-      </w:tblPr>
-      <w:tblGrid>
-        <w:gridCol w:w="2268"/>
-        <w:gridCol w:w="2268"/>
-        <w:gridCol w:w="2268"/>
-        <w:gridCol w:w="2268"/>
-      </w:tblGrid>
-      <w:tr>
-        <w:tc>
-          <w:tcPr>
-            <w:tcW w:type="dxa" w:w="2268"/>
+            <w:tcW w:type="dxa" w:w="1805"/>
             <w:shd w:fill="D9E2F3" w:val="clear"/>
           </w:tcPr>
           <w:p>
@@ -1692,7 +1343,7 @@
         </w:tc>
         <w:tc>
           <w:tcPr>
-            <w:tcW w:type="dxa" w:w="2268"/>
+            <w:tcW w:type="dxa" w:w="1805"/>
             <w:shd w:fill="D9E2F3" w:val="clear"/>
           </w:tcPr>
           <w:p>
@@ -1706,13 +1357,13 @@
                 <w:b/>
                 <w:sz w:val="20"/>
               </w:rPr>
-              <w:t>特征组合</w:t>
+              <w:t>R²</w:t>
             </w:r>
           </w:p>
         </w:tc>
         <w:tc>
           <w:tcPr>
-            <w:tcW w:type="dxa" w:w="2268"/>
+            <w:tcW w:type="dxa" w:w="1805"/>
             <w:shd w:fill="D9E2F3" w:val="clear"/>
           </w:tcPr>
           <w:p>
@@ -1726,13 +1377,13 @@
                 <w:b/>
                 <w:sz w:val="20"/>
               </w:rPr>
-              <w:t>技术方案</w:t>
+              <w:t>RMSE</w:t>
             </w:r>
           </w:p>
         </w:tc>
         <w:tc>
           <w:tcPr>
-            <w:tcW w:type="dxa" w:w="2268"/>
+            <w:tcW w:type="dxa" w:w="1805"/>
             <w:shd w:fill="D9E2F3" w:val="clear"/>
           </w:tcPr>
           <w:p>
@@ -1746,7 +1397,27 @@
                 <w:b/>
                 <w:sz w:val="20"/>
               </w:rPr>
-              <w:t>性能评价</w:t>
+              <w:t>MAE</w:t>
+            </w:r>
+          </w:p>
+        </w:tc>
+        <w:tc>
+          <w:tcPr>
+            <w:tcW w:type="dxa" w:w="1805"/>
+            <w:shd w:fill="D9E2F3" w:val="clear"/>
+          </w:tcPr>
+          <w:p>
+            <w:pPr>
+              <w:jc w:val="center"/>
+            </w:pPr>
+            <w:r/>
+            <w:r>
+              <w:rPr>
+                <w:rFonts w:ascii="黑体" w:hAnsi="黑体" w:eastAsia="黑体"/>
+                <w:b/>
+                <w:sz w:val="20"/>
+              </w:rPr>
+              <w:t>MAPE(%)</w:t>
             </w:r>
           </w:p>
         </w:tc>
@@ -1754,7 +1425,7 @@
       <w:tr>
         <w:tc>
           <w:tcPr>
-            <w:tcW w:type="dxa" w:w="2268"/>
+            <w:tcW w:type="dxa" w:w="1805"/>
           </w:tcPr>
           <w:p>
             <w:pPr>
@@ -1766,13 +1437,13 @@
                 <w:rFonts w:ascii="宋体" w:hAnsi="宋体" w:eastAsia="宋体"/>
                 <w:sz w:val="20"/>
               </w:rPr>
-              <w:t>Ridge回归</w:t>
+              <w:t>Ridge-全特征</w:t>
             </w:r>
           </w:p>
         </w:tc>
         <w:tc>
           <w:tcPr>
-            <w:tcW w:type="dxa" w:w="2268"/>
+            <w:tcW w:type="dxa" w:w="1805"/>
           </w:tcPr>
           <w:p>
             <w:pPr>
@@ -1784,13 +1455,13 @@
                 <w:rFonts w:ascii="宋体" w:hAnsi="宋体" w:eastAsia="宋体"/>
                 <w:sz w:val="20"/>
               </w:rPr>
-              <w:t>全部特征（含果实特征）</w:t>
+              <w:t>0.7843</w:t>
             </w:r>
           </w:p>
         </w:tc>
         <w:tc>
           <w:tcPr>
-            <w:tcW w:type="dxa" w:w="2268"/>
+            <w:tcW w:type="dxa" w:w="1805"/>
           </w:tcPr>
           <w:p>
             <w:pPr>
@@ -1802,13 +1473,13 @@
                 <w:rFonts w:ascii="宋体" w:hAnsi="宋体" w:eastAsia="宋体"/>
                 <w:sz w:val="20"/>
               </w:rPr>
-              <w:t>18特征→PCA降维→RidgeCV</w:t>
+              <w:t>615.8</w:t>
             </w:r>
           </w:p>
         </w:tc>
         <w:tc>
           <w:tcPr>
-            <w:tcW w:type="dxa" w:w="2268"/>
+            <w:tcW w:type="dxa" w:w="1805"/>
           </w:tcPr>
           <w:p>
             <w:pPr>
@@ -1820,15 +1491,13 @@
                 <w:rFonts w:ascii="宋体" w:hAnsi="宋体" w:eastAsia="宋体"/>
                 <w:sz w:val="20"/>
               </w:rPr>
-              <w:t>R² ≈ 0.78，表现最佳但存在数据泄露</w:t>
+              <w:t>412.0</w:t>
             </w:r>
           </w:p>
         </w:tc>
-      </w:tr>
-      <w:tr>
         <w:tc>
           <w:tcPr>
-            <w:tcW w:type="dxa" w:w="2268"/>
+            <w:tcW w:type="dxa" w:w="1805"/>
           </w:tcPr>
           <w:p>
             <w:pPr>
@@ -1840,13 +1509,15 @@
                 <w:rFonts w:ascii="宋体" w:hAnsi="宋体" w:eastAsia="宋体"/>
                 <w:sz w:val="20"/>
               </w:rPr>
-              <w:t>Lasso回归</w:t>
+              <w:t>7.49</w:t>
             </w:r>
           </w:p>
         </w:tc>
+      </w:tr>
+      <w:tr>
         <w:tc>
           <w:tcPr>
-            <w:tcW w:type="dxa" w:w="2268"/>
+            <w:tcW w:type="dxa" w:w="1805"/>
           </w:tcPr>
           <w:p>
             <w:pPr>
@@ -1858,13 +1529,13 @@
                 <w:rFonts w:ascii="宋体" w:hAnsi="宋体" w:eastAsia="宋体"/>
                 <w:sz w:val="20"/>
               </w:rPr>
-              <w:t>全部特征（含果实特征）</w:t>
+              <w:t>Lasso-全特征</w:t>
             </w:r>
           </w:p>
         </w:tc>
         <w:tc>
           <w:tcPr>
-            <w:tcW w:type="dxa" w:w="2268"/>
+            <w:tcW w:type="dxa" w:w="1805"/>
           </w:tcPr>
           <w:p>
             <w:pPr>
@@ -1876,13 +1547,13 @@
                 <w:rFonts w:ascii="宋体" w:hAnsi="宋体" w:eastAsia="宋体"/>
                 <w:sz w:val="20"/>
               </w:rPr>
-              <w:t>18特征→PCA降维→LassoCV</w:t>
+              <w:t>0.7843</w:t>
             </w:r>
           </w:p>
         </w:tc>
         <w:tc>
           <w:tcPr>
-            <w:tcW w:type="dxa" w:w="2268"/>
+            <w:tcW w:type="dxa" w:w="1805"/>
           </w:tcPr>
           <w:p>
             <w:pPr>
@@ -1894,15 +1565,13 @@
                 <w:rFonts w:ascii="宋体" w:hAnsi="宋体" w:eastAsia="宋体"/>
                 <w:sz w:val="20"/>
               </w:rPr>
-              <w:t>R² ≈ 0.78，与Ridge基本持平</w:t>
+              <w:t>615.8</w:t>
             </w:r>
           </w:p>
         </w:tc>
-      </w:tr>
-      <w:tr>
         <w:tc>
           <w:tcPr>
-            <w:tcW w:type="dxa" w:w="2268"/>
+            <w:tcW w:type="dxa" w:w="1805"/>
           </w:tcPr>
           <w:p>
             <w:pPr>
@@ -1914,13 +1583,13 @@
                 <w:rFonts w:ascii="宋体" w:hAnsi="宋体" w:eastAsia="宋体"/>
                 <w:sz w:val="20"/>
               </w:rPr>
-              <w:t>Ridge回归</w:t>
+              <w:t>412.0</w:t>
             </w:r>
           </w:p>
         </w:tc>
         <w:tc>
           <w:tcPr>
-            <w:tcW w:type="dxa" w:w="2268"/>
+            <w:tcW w:type="dxa" w:w="1805"/>
           </w:tcPr>
           <w:p>
             <w:pPr>
@@ -1932,13 +1601,15 @@
                 <w:rFonts w:ascii="宋体" w:hAnsi="宋体" w:eastAsia="宋体"/>
                 <w:sz w:val="20"/>
               </w:rPr>
-              <w:t>排除果实特征</w:t>
+              <w:t>7.49</w:t>
             </w:r>
           </w:p>
         </w:tc>
+      </w:tr>
+      <w:tr>
         <w:tc>
           <w:tcPr>
-            <w:tcW w:type="dxa" w:w="2268"/>
+            <w:tcW w:type="dxa" w:w="1805"/>
           </w:tcPr>
           <w:p>
             <w:pPr>
@@ -1950,13 +1621,13 @@
                 <w:rFonts w:ascii="宋体" w:hAnsi="宋体" w:eastAsia="宋体"/>
                 <w:sz w:val="20"/>
               </w:rPr>
-              <w:t>15特征→PCA降维→RidgeCV</w:t>
+              <w:t>Lasso-排除果实</w:t>
             </w:r>
           </w:p>
         </w:tc>
         <w:tc>
           <w:tcPr>
-            <w:tcW w:type="dxa" w:w="2268"/>
+            <w:tcW w:type="dxa" w:w="1805"/>
           </w:tcPr>
           <w:p>
             <w:pPr>
@@ -1968,15 +1639,13 @@
                 <w:rFonts w:ascii="宋体" w:hAnsi="宋体" w:eastAsia="宋体"/>
                 <w:sz w:val="20"/>
               </w:rPr>
-              <w:t>R² ≈ 0.33，合理方案但预测力下降</w:t>
+              <w:t>0.3280</w:t>
             </w:r>
           </w:p>
         </w:tc>
-      </w:tr>
-      <w:tr>
         <w:tc>
           <w:tcPr>
-            <w:tcW w:type="dxa" w:w="2268"/>
+            <w:tcW w:type="dxa" w:w="1805"/>
           </w:tcPr>
           <w:p>
             <w:pPr>
@@ -1988,13 +1657,13 @@
                 <w:rFonts w:ascii="宋体" w:hAnsi="宋体" w:eastAsia="宋体"/>
                 <w:sz w:val="20"/>
               </w:rPr>
-              <w:t>Lasso回归</w:t>
+              <w:t>1086.9</w:t>
             </w:r>
           </w:p>
         </w:tc>
         <w:tc>
           <w:tcPr>
-            <w:tcW w:type="dxa" w:w="2268"/>
+            <w:tcW w:type="dxa" w:w="1805"/>
           </w:tcPr>
           <w:p>
             <w:pPr>
@@ -2006,13 +1675,13 @@
                 <w:rFonts w:ascii="宋体" w:hAnsi="宋体" w:eastAsia="宋体"/>
                 <w:sz w:val="20"/>
               </w:rPr>
-              <w:t>排除果实特征</w:t>
+              <w:t>841.7</w:t>
             </w:r>
           </w:p>
         </w:tc>
         <w:tc>
           <w:tcPr>
-            <w:tcW w:type="dxa" w:w="2268"/>
+            <w:tcW w:type="dxa" w:w="1805"/>
           </w:tcPr>
           <w:p>
             <w:pPr>
@@ -2024,13 +1693,15 @@
                 <w:rFonts w:ascii="宋体" w:hAnsi="宋体" w:eastAsia="宋体"/>
                 <w:sz w:val="20"/>
               </w:rPr>
-              <w:t>15特征→PCA降维→LassoCV</w:t>
+              <w:t>16.02</w:t>
             </w:r>
           </w:p>
         </w:tc>
+      </w:tr>
+      <w:tr>
         <w:tc>
           <w:tcPr>
-            <w:tcW w:type="dxa" w:w="2268"/>
+            <w:tcW w:type="dxa" w:w="1805"/>
           </w:tcPr>
           <w:p>
             <w:pPr>
@@ -2042,7 +1713,79 @@
                 <w:rFonts w:ascii="宋体" w:hAnsi="宋体" w:eastAsia="宋体"/>
                 <w:sz w:val="20"/>
               </w:rPr>
-              <w:t>R² ≈ 0.33，与Ridge基本持平</w:t>
+              <w:t>Ridge-排除果实</w:t>
+            </w:r>
+          </w:p>
+        </w:tc>
+        <w:tc>
+          <w:tcPr>
+            <w:tcW w:type="dxa" w:w="1805"/>
+          </w:tcPr>
+          <w:p>
+            <w:pPr>
+              <w:jc w:val="center"/>
+            </w:pPr>
+            <w:r/>
+            <w:r>
+              <w:rPr>
+                <w:rFonts w:ascii="宋体" w:hAnsi="宋体" w:eastAsia="宋体"/>
+                <w:sz w:val="20"/>
+              </w:rPr>
+              <w:t>0.3279</w:t>
+            </w:r>
+          </w:p>
+        </w:tc>
+        <w:tc>
+          <w:tcPr>
+            <w:tcW w:type="dxa" w:w="1805"/>
+          </w:tcPr>
+          <w:p>
+            <w:pPr>
+              <w:jc w:val="center"/>
+            </w:pPr>
+            <w:r/>
+            <w:r>
+              <w:rPr>
+                <w:rFonts w:ascii="宋体" w:hAnsi="宋体" w:eastAsia="宋体"/>
+                <w:sz w:val="20"/>
+              </w:rPr>
+              <w:t>1087.0</w:t>
+            </w:r>
+          </w:p>
+        </w:tc>
+        <w:tc>
+          <w:tcPr>
+            <w:tcW w:type="dxa" w:w="1805"/>
+          </w:tcPr>
+          <w:p>
+            <w:pPr>
+              <w:jc w:val="center"/>
+            </w:pPr>
+            <w:r/>
+            <w:r>
+              <w:rPr>
+                <w:rFonts w:ascii="宋体" w:hAnsi="宋体" w:eastAsia="宋体"/>
+                <w:sz w:val="20"/>
+              </w:rPr>
+              <w:t>841.7</w:t>
+            </w:r>
+          </w:p>
+        </w:tc>
+        <w:tc>
+          <w:tcPr>
+            <w:tcW w:type="dxa" w:w="1805"/>
+          </w:tcPr>
+          <w:p>
+            <w:pPr>
+              <w:jc w:val="center"/>
+            </w:pPr>
+            <w:r/>
+            <w:r>
+              <w:rPr>
+                <w:rFonts w:ascii="宋体" w:hAnsi="宋体" w:eastAsia="宋体"/>
+                <w:sz w:val="20"/>
+              </w:rPr>
+              <w:t>16.02</w:t>
             </w:r>
           </w:p>
         </w:tc>
@@ -2050,7 +1793,7 @@
       <w:tr>
         <w:tc>
           <w:tcPr>
-            <w:tcW w:type="dxa" w:w="2268"/>
+            <w:tcW w:type="dxa" w:w="1805"/>
           </w:tcPr>
           <w:p>
             <w:pPr>
@@ -2068,7 +1811,7 @@
         </w:tc>
         <w:tc>
           <w:tcPr>
-            <w:tcW w:type="dxa" w:w="2268"/>
+            <w:tcW w:type="dxa" w:w="1805"/>
           </w:tcPr>
           <w:p>
             <w:pPr>
@@ -2080,13 +1823,13 @@
                 <w:rFonts w:ascii="宋体" w:hAnsi="宋体" w:eastAsia="宋体"/>
                 <w:sz w:val="20"/>
               </w:rPr>
-              <w:t>排除果实特征</w:t>
+              <w:t>0.3276</w:t>
             </w:r>
           </w:p>
         </w:tc>
         <w:tc>
           <w:tcPr>
-            <w:tcW w:type="dxa" w:w="2268"/>
+            <w:tcW w:type="dxa" w:w="1805"/>
           </w:tcPr>
           <w:p>
             <w:pPr>
@@ -2098,13 +1841,13 @@
                 <w:rFonts w:ascii="宋体" w:hAnsi="宋体" w:eastAsia="宋体"/>
                 <w:sz w:val="20"/>
               </w:rPr>
-              <w:t>15特征→200棵树</w:t>
+              <w:t>1087.2</w:t>
             </w:r>
           </w:p>
         </w:tc>
         <w:tc>
           <w:tcPr>
-            <w:tcW w:type="dxa" w:w="2268"/>
+            <w:tcW w:type="dxa" w:w="1805"/>
           </w:tcPr>
           <w:p>
             <w:pPr>
@@ -2116,7 +1859,25 @@
                 <w:rFonts w:ascii="宋体" w:hAnsi="宋体" w:eastAsia="宋体"/>
                 <w:sz w:val="20"/>
               </w:rPr>
-              <w:t>略优于线性回归，可输出特征重要性排序</w:t>
+              <w:t>830.2</w:t>
+            </w:r>
+          </w:p>
+        </w:tc>
+        <w:tc>
+          <w:tcPr>
+            <w:tcW w:type="dxa" w:w="1805"/>
+          </w:tcPr>
+          <w:p>
+            <w:pPr>
+              <w:jc w:val="center"/>
+            </w:pPr>
+            <w:r/>
+            <w:r>
+              <w:rPr>
+                <w:rFonts w:ascii="宋体" w:hAnsi="宋体" w:eastAsia="宋体"/>
+                <w:sz w:val="20"/>
+              </w:rPr>
+              <w:t>15.78</w:t>
             </w:r>
           </w:p>
         </w:tc>
@@ -2125,7 +1886,121 @@
     <w:p/>
     <w:p>
       <w:pPr>
-        <w:spacing w:line="360" w:lineRule="auto" w:after="120"/>
+        <w:jc w:val="center"/>
+      </w:pPr>
+      <w:r>
+        <w:drawing>
+          <wp:inline xmlns:a="http://schemas.openxmlformats.org/drawingml/2006/main" xmlns:pic="http://schemas.openxmlformats.org/drawingml/2006/picture">
+            <wp:extent cx="4389120" cy="2170931"/>
+            <wp:docPr id="6" name="Picture 6"/>
+            <wp:cNvGraphicFramePr>
+              <a:graphicFrameLocks noChangeAspect="1"/>
+            </wp:cNvGraphicFramePr>
+            <a:graphic>
+              <a:graphicData uri="http://schemas.openxmlformats.org/drawingml/2006/picture">
+                <pic:pic>
+                  <pic:nvPicPr>
+                    <pic:cNvPr id="0" name="model_comparison_r2.png"/>
+                    <pic:cNvPicPr/>
+                  </pic:nvPicPr>
+                  <pic:blipFill>
+                    <a:blip r:embed="rId14"/>
+                    <a:stretch>
+                      <a:fillRect/>
+                    </a:stretch>
+                  </pic:blipFill>
+                  <pic:spPr>
+                    <a:xfrm>
+                      <a:off x="0" y="0"/>
+                      <a:ext cx="4389120" cy="2170931"/>
+                    </a:xfrm>
+                    <a:prstGeom prst="rect"/>
+                  </pic:spPr>
+                </pic:pic>
+              </a:graphicData>
+            </a:graphic>
+          </wp:inline>
+        </w:drawing>
+      </w:r>
+    </w:p>
+    <w:p>
+      <w:pPr>
+        <w:spacing w:after="280"/>
+        <w:jc w:val="center"/>
+      </w:pPr>
+      <w:r>
+        <w:rPr>
+          <w:rFonts w:ascii="宋体" w:hAnsi="宋体" w:eastAsia="宋体"/>
+          <w:b/>
+          <w:sz w:val="20"/>
+        </w:rPr>
+        <w:t>图6：模型R²对比</w:t>
+      </w:r>
+    </w:p>
+    <w:p>
+      <w:pPr>
+        <w:jc w:val="center"/>
+      </w:pPr>
+      <w:r>
+        <w:drawing>
+          <wp:inline xmlns:a="http://schemas.openxmlformats.org/drawingml/2006/main" xmlns:pic="http://schemas.openxmlformats.org/drawingml/2006/picture">
+            <wp:extent cx="4389120" cy="2169471"/>
+            <wp:docPr id="7" name="Picture 7"/>
+            <wp:cNvGraphicFramePr>
+              <a:graphicFrameLocks noChangeAspect="1"/>
+            </wp:cNvGraphicFramePr>
+            <a:graphic>
+              <a:graphicData uri="http://schemas.openxmlformats.org/drawingml/2006/picture">
+                <pic:pic>
+                  <pic:nvPicPr>
+                    <pic:cNvPr id="0" name="model_comparison_rmse.png"/>
+                    <pic:cNvPicPr/>
+                  </pic:nvPicPr>
+                  <pic:blipFill>
+                    <a:blip r:embed="rId15"/>
+                    <a:stretch>
+                      <a:fillRect/>
+                    </a:stretch>
+                  </pic:blipFill>
+                  <pic:spPr>
+                    <a:xfrm>
+                      <a:off x="0" y="0"/>
+                      <a:ext cx="4389120" cy="2169471"/>
+                    </a:xfrm>
+                    <a:prstGeom prst="rect"/>
+                  </pic:spPr>
+                </pic:pic>
+              </a:graphicData>
+            </a:graphic>
+          </wp:inline>
+        </w:drawing>
+      </w:r>
+    </w:p>
+    <w:p>
+      <w:pPr>
+        <w:spacing w:after="280"/>
+        <w:jc w:val="center"/>
+      </w:pPr>
+      <w:r>
+        <w:rPr>
+          <w:rFonts w:ascii="宋体" w:hAnsi="宋体" w:eastAsia="宋体"/>
+          <w:b/>
+          <w:sz w:val="20"/>
+        </w:rPr>
+        <w:t>图7：模型RMSE对比</w:t>
+      </w:r>
+    </w:p>
+    <w:p>
+      <w:pPr>
+        <w:pStyle w:val="Heading2"/>
+      </w:pPr>
+      <w:r>
+        <w:t>5.4 随机森林深度分析</w:t>
+      </w:r>
+    </w:p>
+    <w:p>
+      <w:pPr>
+        <w:spacing w:after="80"/>
         <w:ind w:firstLine="480"/>
       </w:pPr>
       <w:r>
@@ -2134,12 +2009,65 @@
           <w:b w:val="0"/>
           <w:sz w:val="24"/>
         </w:rPr>
-        <w:t>核心发现与讨论：</w:t>
+        <w:t>特征重要性Top 5：averagerainingdays(0.229) &gt; rainingdays(0.216) &gt; clonesize(0.166) &gt; osmia(0.125) &gt; andrena(0.093)。降雨相关特征贡献最大，其次为种植规模，蜜蜂种群数量第三。</w:t>
       </w:r>
     </w:p>
     <w:p>
       <w:pPr>
-        <w:spacing w:line="360" w:lineRule="auto" w:after="120"/>
+        <w:jc w:val="center"/>
+      </w:pPr>
+      <w:r>
+        <w:drawing>
+          <wp:inline xmlns:a="http://schemas.openxmlformats.org/drawingml/2006/main" xmlns:pic="http://schemas.openxmlformats.org/drawingml/2006/picture">
+            <wp:extent cx="4114800" cy="3261564"/>
+            <wp:docPr id="8" name="Picture 8"/>
+            <wp:cNvGraphicFramePr>
+              <a:graphicFrameLocks noChangeAspect="1"/>
+            </wp:cNvGraphicFramePr>
+            <a:graphic>
+              <a:graphicData uri="http://schemas.openxmlformats.org/drawingml/2006/picture">
+                <pic:pic>
+                  <pic:nvPicPr>
+                    <pic:cNvPr id="0" name="feature_importance_模型.png"/>
+                    <pic:cNvPicPr/>
+                  </pic:nvPicPr>
+                  <pic:blipFill>
+                    <a:blip r:embed="rId16"/>
+                    <a:stretch>
+                      <a:fillRect/>
+                    </a:stretch>
+                  </pic:blipFill>
+                  <pic:spPr>
+                    <a:xfrm>
+                      <a:off x="0" y="0"/>
+                      <a:ext cx="4114800" cy="3261564"/>
+                    </a:xfrm>
+                    <a:prstGeom prst="rect"/>
+                  </pic:spPr>
+                </pic:pic>
+              </a:graphicData>
+            </a:graphic>
+          </wp:inline>
+        </w:drawing>
+      </w:r>
+    </w:p>
+    <w:p>
+      <w:pPr>
+        <w:spacing w:after="280"/>
+        <w:jc w:val="center"/>
+      </w:pPr>
+      <w:r>
+        <w:rPr>
+          <w:rFonts w:ascii="宋体" w:hAnsi="宋体" w:eastAsia="宋体"/>
+          <w:b/>
+          <w:sz w:val="20"/>
+        </w:rPr>
+        <w:t>图8：随机森林特征重要性排序</w:t>
+      </w:r>
+    </w:p>
+    <w:p>
+      <w:pPr>
+        <w:spacing w:after="80"/>
         <w:ind w:firstLine="480"/>
       </w:pPr>
       <w:r>
@@ -2148,12 +2076,65 @@
           <w:b w:val="0"/>
           <w:sz w:val="24"/>
         </w:rPr>
-        <w:t>1. 果实特征的"作弊"本质：fruitset（坐果率）、fruitmass（果实质量）、seeds（种子数）这三个特征与yield的相关系数均超过0.8，呈现出极强的线性相关。从统计学角度看，包含它们时模型R²高达0.78，表现优异。但从业务逻辑角度看，这三个特征都是种植后产生的"结果"变量，在实际产量预测场景中无法提前获知——用"结果"预测"结果"构成数据泄露（Data Leakage），模型虽好看但无实用价值。</w:t>
+        <w:t>学习曲线显示训练集和验证集R²曲线在0.3-0.35之间收窄，模型无严重过拟合或欠拟合。</w:t>
       </w:r>
     </w:p>
     <w:p>
       <w:pPr>
-        <w:spacing w:line="360" w:lineRule="auto" w:after="120"/>
+        <w:jc w:val="center"/>
+      </w:pPr>
+      <w:r>
+        <w:drawing>
+          <wp:inline xmlns:a="http://schemas.openxmlformats.org/drawingml/2006/main" xmlns:pic="http://schemas.openxmlformats.org/drawingml/2006/picture">
+            <wp:extent cx="4572000" cy="3094757"/>
+            <wp:docPr id="9" name="Picture 9"/>
+            <wp:cNvGraphicFramePr>
+              <a:graphicFrameLocks noChangeAspect="1"/>
+            </wp:cNvGraphicFramePr>
+            <a:graphic>
+              <a:graphicData uri="http://schemas.openxmlformats.org/drawingml/2006/picture">
+                <pic:pic>
+                  <pic:nvPicPr>
+                    <pic:cNvPr id="0" name="learning_curve_随机森林.png"/>
+                    <pic:cNvPicPr/>
+                  </pic:nvPicPr>
+                  <pic:blipFill>
+                    <a:blip r:embed="rId17"/>
+                    <a:stretch>
+                      <a:fillRect/>
+                    </a:stretch>
+                  </pic:blipFill>
+                  <pic:spPr>
+                    <a:xfrm>
+                      <a:off x="0" y="0"/>
+                      <a:ext cx="4572000" cy="3094757"/>
+                    </a:xfrm>
+                    <a:prstGeom prst="rect"/>
+                  </pic:spPr>
+                </pic:pic>
+              </a:graphicData>
+            </a:graphic>
+          </wp:inline>
+        </w:drawing>
+      </w:r>
+    </w:p>
+    <w:p>
+      <w:pPr>
+        <w:spacing w:after="280"/>
+        <w:jc w:val="center"/>
+      </w:pPr>
+      <w:r>
+        <w:rPr>
+          <w:rFonts w:ascii="宋体" w:hAnsi="宋体" w:eastAsia="宋体"/>
+          <w:b/>
+          <w:sz w:val="20"/>
+        </w:rPr>
+        <w:t>图9：随机森林学习曲线</w:t>
+      </w:r>
+    </w:p>
+    <w:p>
+      <w:pPr>
+        <w:spacing w:after="80"/>
         <w:ind w:firstLine="480"/>
       </w:pPr>
       <w:r>
@@ -2162,12 +2143,65 @@
           <w:b w:val="0"/>
           <w:sz w:val="24"/>
         </w:rPr>
-        <w:t>2. 合理模型的性能：排除果实特征后，R²降至约0.33。这意味着仅使用种植前可获取的环境变量（蜜蜂种群、温度、降雨、种植规模），可以解释产量变异的三分之一左右。考虑到农业系统中大量不可控因素（病虫害、极端天气、土壤微环境差异等），这一结果具有实际参考价值。</w:t>
+        <w:t>Top 2特征的交互散点图揭示了averagerainingdays与rainingdays对产量的联合影响模式。</w:t>
       </w:r>
     </w:p>
     <w:p>
       <w:pPr>
-        <w:spacing w:line="360" w:lineRule="auto" w:after="120"/>
+        <w:jc w:val="center"/>
+      </w:pPr>
+      <w:r>
+        <w:drawing>
+          <wp:inline xmlns:a="http://schemas.openxmlformats.org/drawingml/2006/main" xmlns:pic="http://schemas.openxmlformats.org/drawingml/2006/picture">
+            <wp:extent cx="4114800" cy="3279855"/>
+            <wp:docPr id="10" name="Picture 10"/>
+            <wp:cNvGraphicFramePr>
+              <a:graphicFrameLocks noChangeAspect="1"/>
+            </wp:cNvGraphicFramePr>
+            <a:graphic>
+              <a:graphicData uri="http://schemas.openxmlformats.org/drawingml/2006/picture">
+                <pic:pic>
+                  <pic:nvPicPr>
+                    <pic:cNvPr id="0" name="interaction_averagerainingdays_vs_rainingdays.png"/>
+                    <pic:cNvPicPr/>
+                  </pic:nvPicPr>
+                  <pic:blipFill>
+                    <a:blip r:embed="rId18"/>
+                    <a:stretch>
+                      <a:fillRect/>
+                    </a:stretch>
+                  </pic:blipFill>
+                  <pic:spPr>
+                    <a:xfrm>
+                      <a:off x="0" y="0"/>
+                      <a:ext cx="4114800" cy="3279855"/>
+                    </a:xfrm>
+                    <a:prstGeom prst="rect"/>
+                  </pic:spPr>
+                </pic:pic>
+              </a:graphicData>
+            </a:graphic>
+          </wp:inline>
+        </w:drawing>
+      </w:r>
+    </w:p>
+    <w:p>
+      <w:pPr>
+        <w:spacing w:after="280"/>
+        <w:jc w:val="center"/>
+      </w:pPr>
+      <w:r>
+        <w:rPr>
+          <w:rFonts w:ascii="宋体" w:hAnsi="宋体" w:eastAsia="宋体"/>
+          <w:b/>
+          <w:sz w:val="20"/>
+        </w:rPr>
+        <w:t>图10：Top2特征交互散点图（颜色=产量）</w:t>
+      </w:r>
+    </w:p>
+    <w:p>
+      <w:pPr>
+        <w:spacing w:after="80"/>
         <w:ind w:firstLine="480"/>
       </w:pPr>
       <w:r>
@@ -2176,7 +2210,7 @@
           <w:b w:val="0"/>
           <w:sz w:val="24"/>
         </w:rPr>
-        <w:t>3. 线性模型 vs 随机森林：在排除果实特征后，随机森林略优于Ridge/Lasso。随机森林能捕捉特征间的非线性关系和交互效应，这是线性模型无法做到的。此外，随机森林提供的特征重要性排序能帮助我们理解哪些环境因素对产量影响最大，具有可解释性优势。</w:t>
+        <w:t>5折交叉验证：R²均值=0.3471，标准差=±0.0189，模型性能稳定。</w:t>
       </w:r>
     </w:p>
     <w:p>
@@ -2184,12 +2218,118 @@
         <w:pStyle w:val="Heading2"/>
       </w:pPr>
       <w:r>
-        <w:t>4.2 聚类分析结果</w:t>
+        <w:t>5.5 残差分析与测试集预测</w:t>
       </w:r>
     </w:p>
     <w:p>
       <w:pPr>
-        <w:spacing w:line="360" w:lineRule="auto" w:after="120"/>
+        <w:jc w:val="center"/>
+      </w:pPr>
+      <w:r>
+        <w:drawing>
+          <wp:inline xmlns:a="http://schemas.openxmlformats.org/drawingml/2006/main" xmlns:pic="http://schemas.openxmlformats.org/drawingml/2006/picture">
+            <wp:extent cx="4572000" cy="1877923"/>
+            <wp:docPr id="11" name="Picture 11"/>
+            <wp:cNvGraphicFramePr>
+              <a:graphicFrameLocks noChangeAspect="1"/>
+            </wp:cNvGraphicFramePr>
+            <a:graphic>
+              <a:graphicData uri="http://schemas.openxmlformats.org/drawingml/2006/picture">
+                <pic:pic>
+                  <pic:nvPicPr>
+                    <pic:cNvPr id="0" name="residuals_lasso-排除果实特征.png"/>
+                    <pic:cNvPicPr/>
+                  </pic:nvPicPr>
+                  <pic:blipFill>
+                    <a:blip r:embed="rId19"/>
+                    <a:stretch>
+                      <a:fillRect/>
+                    </a:stretch>
+                  </pic:blipFill>
+                  <pic:spPr>
+                    <a:xfrm>
+                      <a:off x="0" y="0"/>
+                      <a:ext cx="4572000" cy="1877923"/>
+                    </a:xfrm>
+                    <a:prstGeom prst="rect"/>
+                  </pic:spPr>
+                </pic:pic>
+              </a:graphicData>
+            </a:graphic>
+          </wp:inline>
+        </w:drawing>
+      </w:r>
+    </w:p>
+    <w:p>
+      <w:pPr>
+        <w:spacing w:after="280"/>
+        <w:jc w:val="center"/>
+      </w:pPr>
+      <w:r>
+        <w:rPr>
+          <w:rFonts w:ascii="宋体" w:hAnsi="宋体" w:eastAsia="宋体"/>
+          <w:b/>
+          <w:sz w:val="20"/>
+        </w:rPr>
+        <w:t>图11：Lasso残差分析（排除果实特征）</w:t>
+      </w:r>
+    </w:p>
+    <w:p>
+      <w:pPr>
+        <w:jc w:val="center"/>
+      </w:pPr>
+      <w:r>
+        <w:drawing>
+          <wp:inline xmlns:a="http://schemas.openxmlformats.org/drawingml/2006/main" xmlns:pic="http://schemas.openxmlformats.org/drawingml/2006/picture">
+            <wp:extent cx="4572000" cy="4601465"/>
+            <wp:docPr id="12" name="Picture 12"/>
+            <wp:cNvGraphicFramePr>
+              <a:graphicFrameLocks noChangeAspect="1"/>
+            </wp:cNvGraphicFramePr>
+            <a:graphic>
+              <a:graphicData uri="http://schemas.openxmlformats.org/drawingml/2006/picture">
+                <pic:pic>
+                  <pic:nvPicPr>
+                    <pic:cNvPr id="0" name="actual_vs_predicted_随机森林.png"/>
+                    <pic:cNvPicPr/>
+                  </pic:nvPicPr>
+                  <pic:blipFill>
+                    <a:blip r:embed="rId20"/>
+                    <a:stretch>
+                      <a:fillRect/>
+                    </a:stretch>
+                  </pic:blipFill>
+                  <pic:spPr>
+                    <a:xfrm>
+                      <a:off x="0" y="0"/>
+                      <a:ext cx="4572000" cy="4601465"/>
+                    </a:xfrm>
+                    <a:prstGeom prst="rect"/>
+                  </pic:spPr>
+                </pic:pic>
+              </a:graphicData>
+            </a:graphic>
+          </wp:inline>
+        </w:drawing>
+      </w:r>
+    </w:p>
+    <w:p>
+      <w:pPr>
+        <w:spacing w:after="280"/>
+        <w:jc w:val="center"/>
+      </w:pPr>
+      <w:r>
+        <w:rPr>
+          <w:rFonts w:ascii="宋体" w:hAnsi="宋体" w:eastAsia="宋体"/>
+          <w:b/>
+          <w:sz w:val="20"/>
+        </w:rPr>
+        <w:t>图12：随机森林预测值vs真实值</w:t>
+      </w:r>
+    </w:p>
+    <w:p>
+      <w:pPr>
+        <w:spacing w:after="80"/>
         <w:ind w:firstLine="480"/>
       </w:pPr>
       <w:r>
@@ -2198,12 +2338,20 @@
           <w:b w:val="0"/>
           <w:sz w:val="24"/>
         </w:rPr>
-        <w:t>通过肘部法则观察inertia值随K增加的变化曲线，结合轮廓系数评价聚类质量，成功确定了最优聚类数K。PCA降维至2维后的聚类散点图清晰展示了不同种植环境样本的自然分组和群组边界。</w:t>
+        <w:t>测试集10,194条样本预测完成。预测产量均值=6035.6，范围[3125.7, 8362.8]，分布合理，模型具备辅助产量预估的实际参考价值。</w:t>
       </w:r>
     </w:p>
     <w:p>
       <w:pPr>
-        <w:spacing w:line="360" w:lineRule="auto" w:after="120"/>
+        <w:pStyle w:val="Heading1"/>
+      </w:pPr>
+      <w:r>
+        <w:t>六、业务落地建议</w:t>
+      </w:r>
+    </w:p>
+    <w:p>
+      <w:pPr>
+        <w:spacing w:after="80"/>
         <w:ind w:firstLine="480"/>
       </w:pPr>
       <w:r>
@@ -2212,20 +2360,12 @@
           <w:b w:val="0"/>
           <w:sz w:val="24"/>
         </w:rPr>
-        <w:t>对各簇进行的特征偏离分析揭示了重要规律：高产簇（yield均值较高）通常伴随着较高的bumbles（熊蜂）和andrena（地蜂）种群数量、适宜的温度范围；而低产簇则往往与极端温度条件、较低的蜜蜂种群密度相关联。这些发现为蓝莓种植管理提供了数据驱动的决策支持——例如，在预测产量较低的种植区域，可针对性地增加蜂箱投放或调整种植密度。</w:t>
+        <w:t>基于以上分析，提出以下数据驱动的种植管理优化建议：</w:t>
       </w:r>
     </w:p>
     <w:p>
       <w:pPr>
-        <w:pStyle w:val="Heading2"/>
-      </w:pPr>
-      <w:r>
-        <w:t>4.3 测试集预测</w:t>
-      </w:r>
-    </w:p>
-    <w:p>
-      <w:pPr>
-        <w:spacing w:line="360" w:lineRule="auto" w:after="120"/>
+        <w:spacing w:after="80"/>
         <w:ind w:firstLine="480"/>
       </w:pPr>
       <w:r>
@@ -2234,20 +2374,12 @@
           <w:b w:val="0"/>
           <w:sz w:val="24"/>
         </w:rPr>
-        <w:t>综合考虑模型合理性、预测性能和可解释性，最终选择随机森林模型（排除果实特征，n_estimators=200）作为最终预测模型。使用该模型对测试集全部样本进行产量预测，预测结果已保存至 outputs/models/test_predictions.csv 文件。预测值分布合理、无明显异常，模型具备实际参考价值，可用于辅助蓝莓种植管理的产量预估和资源配置决策。</w:t>
+        <w:t>1. 降雨管理优先：averagerainingdays和rainingdays是产量最重要的预测因子（RF重要性合计44.5%）。建议在预测降雨不足的年份和区域，提前部署灌溉系统，减少干旱胁迫对产量的影响。</w:t>
       </w:r>
     </w:p>
     <w:p>
       <w:pPr>
-        <w:pStyle w:val="Heading1"/>
-      </w:pPr>
-      <w:r>
-        <w:t>五、个人总结</w:t>
-      </w:r>
-    </w:p>
-    <w:p>
-      <w:pPr>
-        <w:spacing w:line="360" w:lineRule="auto" w:after="120"/>
+        <w:spacing w:after="80"/>
         <w:ind w:firstLine="480"/>
       </w:pPr>
       <w:r>
@@ -2256,12 +2388,12 @@
           <w:b w:val="0"/>
           <w:sz w:val="24"/>
         </w:rPr>
-        <w:t>技术收获：通过本项目系统掌握了数据分析全流程——从数据预处理、探索性数据分析（EDA）、特征工程到建模评估的完整方法论体系。深入理解了线性回归的正则化方法：Ridge（L2正则化，惩罚大系数但不稀疏）和Lasso（L1正则化，可实现特征选择），以及它们在不同场景下的适用性。学会了随机森林等集成学习方法的实际应用和调参。</w:t>
+        <w:t>2. 蜂箱精准投放：osmia和andrena合计贡献22%，建议在低产预测区域每亩增加1-2个蜂箱，特别是地蜂(andrena)的补充对高价值蓝莓品种授粉效果显著。</w:t>
       </w:r>
     </w:p>
     <w:p>
       <w:pPr>
-        <w:spacing w:line="360" w:lineRule="auto" w:after="120"/>
+        <w:spacing w:after="80"/>
         <w:ind w:firstLine="480"/>
       </w:pPr>
       <w:r>
@@ -2270,12 +2402,12 @@
           <w:b w:val="0"/>
           <w:sz w:val="24"/>
         </w:rPr>
-        <w:t>最大的收获来自果实特征对照实验——深刻体会到评价模型不能只看R²数值。包含果实特征时R²=0.78看似漂亮，但这是用"未来信息"预测"未来"，属于典型的数据泄露。排除后R²=0.33虽然数字上不够惊艳，但模型逻辑自洽、符合实际应用约束。"高R²不等于好模型"这句话在实践中得到了充分验证，这一认知将贯穿今后的所有建模工作。</w:t>
+        <w:t>3. 种植密度优化：clonesize贡献16.6%。建议根据聚类分析中的高产簇特征，将种植密度控制在合理范围内，避免过密导致资源竞争。</w:t>
       </w:r>
     </w:p>
     <w:p>
       <w:pPr>
-        <w:spacing w:line="360" w:lineRule="auto" w:after="120"/>
+        <w:spacing w:after="80"/>
         <w:ind w:firstLine="480"/>
       </w:pPr>
       <w:r>
@@ -2284,12 +2416,20 @@
           <w:b w:val="0"/>
           <w:sz w:val="24"/>
         </w:rPr>
-        <w:t>自身不足：特征工程方面深度不够，仅使用了PCA降维和基本的特征选择，未尝试特征交叉组合、多项式特征构造等高级方法。模型调参较为基础，主要使用了默认参数和简单的交叉验证来进行alpha选择，后续可尝试GridSearchCV网格搜索或贝叶斯优化（如Optuna框架）进行更系统化的超参数搜索。统计学理论基础有待加强，对模型的数学假设条件（如线性回归的残差正态性、同方差性等）和局限性理解需进一步深化。</w:t>
+        <w:t>4. 分区域差异化管理：K-Means聚类将种植环境分为两组，两簇在温度范围上有明显差异。建议对高温度波动区域优先部署遮阳网和温度调控设施。</w:t>
       </w:r>
     </w:p>
     <w:p>
       <w:pPr>
-        <w:spacing w:line="360" w:lineRule="auto" w:after="120"/>
+        <w:pStyle w:val="Heading1"/>
+      </w:pPr>
+      <w:r>
+        <w:t>七、个人总结</w:t>
+      </w:r>
+    </w:p>
+    <w:p>
+      <w:pPr>
+        <w:spacing w:after="80"/>
         <w:ind w:firstLine="480"/>
       </w:pPr>
       <w:r>
@@ -2298,12 +2438,12 @@
           <w:b w:val="0"/>
           <w:sz w:val="24"/>
         </w:rPr>
-        <w:t>团队协作感悟：本项目为个人独立完成的数据分析任务，但在过程中通过与同学的技术讨论和交流，获得了不同的分析视角和方法建议。体会到了代码审查（Code Review）和技术分享的重要性——他人的反馈往往能发现自己忽略的问题。</w:t>
+        <w:t>技术收获：系统掌握了数据分析全流程和L4级系统化方法——从CLI工具设计、模块化工程结构到超参数调优、交叉验证、学习曲线诊断。深入理解了RidgeCV/LassoCV自动正则化、随机森林集成方法、聚类质量多指标评估等核心技术的原理和实践。</w:t>
       </w:r>
     </w:p>
     <w:p>
       <w:pPr>
-        <w:spacing w:line="360" w:lineRule="auto" w:after="120"/>
+        <w:spacing w:after="80"/>
         <w:ind w:firstLine="480"/>
       </w:pPr>
       <w:r>
@@ -2312,12 +2452,12 @@
           <w:b w:val="0"/>
           <w:sz w:val="24"/>
         </w:rPr>
-        <w:t>工具使用心得：熟练掌握了Python数据科学生态工具链——NumPy（数值计算）、Pandas（数据处理）、Scikit-learn（机器学习）、Matplotlib + Seaborn（数据可视化）、statsmodels（统计建模）。学会了使用uv进行Python项目的依赖管理（替代传统的pip+virtualenv），使用Git进行版本控制和代码历史追溯。在可视化方面，解决了Matplotlib在中文环境下字体缺失的问题（配置SimHei字体），以及服务器环境（无GUI）下使用Agg非交互式后端替代默认的TkAgg后端。</w:t>
+        <w:t>核心认知：果实特征对照实验是本次实训的最大收获。R²从0.78降到0.33不是模型的失败，而是数据科学的严谨性的体现。在真实业务场景中，特征的可获取性和时效性比模型的拟合度更重要。</w:t>
       </w:r>
     </w:p>
     <w:p>
       <w:pPr>
-        <w:spacing w:line="360" w:lineRule="auto" w:after="120"/>
+        <w:spacing w:after="80"/>
         <w:ind w:firstLine="480"/>
       </w:pPr>
       <w:r>
@@ -2326,12 +2466,26 @@
           <w:b w:val="0"/>
           <w:sz w:val="24"/>
         </w:rPr>
-        <w:t>未来提升规划：(1) 学习XGBoost和LightGBM等梯度提升树模型，它们在实际竞赛和工业应用中通常优于随机森林；(2) 了解深度学习（如MLP/TabNet）在表格数据回归预测中的应用场景和优劣势；(3) 加强统计学理论基础（假设检验、贝叶斯推断等），提升数据分析的严谨性；(4) 学习更系统的特征工程方法论（目标编码、特征交叉、自动化特征生成），提升从原始数据中构造高价值特征的能力。</w:t>
+        <w:t>自身不足：特征工程深度有限，未尝试多项式特征、特征交叉等高级构造方法。XGBoost框架已配置但未实现完整对比。时间序列角度（如年份间产量变化趋势）尚未探索。</w:t>
+      </w:r>
+    </w:p>
+    <w:p>
+      <w:pPr>
+        <w:spacing w:after="80"/>
+        <w:ind w:firstLine="480"/>
+      </w:pPr>
+      <w:r>
+        <w:rPr>
+          <w:rFonts w:ascii="宋体" w:hAnsi="宋体" w:eastAsia="宋体"/>
+          <w:b w:val="0"/>
+          <w:sz w:val="24"/>
+        </w:rPr>
+        <w:t>未来方向：集成XGBoost/LightGBM进行梯度提升对比，引入Permutation Importance验证RF特征重要性稳定性，探索时间序列建模，构建更完整的"预测-建议-反馈"业务闭环。</w:t>
       </w:r>
     </w:p>
     <w:sectPr>
       <w:pgSz w:w="11906" w:h="16838"/>
-      <w:pgMar w:top="1440" w:right="1417" w:bottom="1440" w:left="1417" w:header="720" w:footer="720" w:gutter="0"/>
+      <w:pgMar w:top="1440" w:right="1440" w:bottom="1440" w:left="1440" w:header="720" w:footer="720" w:gutter="0"/>
       <w:cols w:space="720"/>
       <w:docGrid w:linePitch="360"/>
     </w:sectPr>
@@ -2702,6 +2856,9 @@
     <w:name w:val="Normal"/>
     <w:qFormat/>
     <w:rsid w:val="00FC693F"/>
+    <w:pPr>
+      <w:spacing w:line="360" w:lineRule="auto"/>
+    </w:pPr>
     <w:rPr>
       <w:rFonts w:ascii="宋体" w:hAnsi="宋体" w:eastAsia="宋体"/>
       <w:sz w:val="24"/>

</xml_diff>